<commit_message>
Revise subsection headings to match Chinese economics journal conventions
Co-authored-by: ruiheng111 <ruiheng111@users.noreply.github.com>
</commit_message>
<xml_diff>
--- a/新建 DOCX 文档.docx
+++ b/新建 DOCX 文档.docx
@@ -45,7 +45,7 @@
           <w:i w:val="0"/>
           <w:sz w:val="21"/>
         </w:rPr>
-        <w:t>1.1 高增长与外部融资的共生</w:t>
+        <w:t>（一）高增长与外部融资依赖</w:t>
       </w:r>
     </w:p>
     <w:p>
@@ -56,7 +56,26 @@
           <w:i w:val="0"/>
           <w:sz w:val="21"/>
         </w:rPr>
-        <w:t>1985年至1996年间，东亚多个经济体实现了持续的高速增长。这一增长模式具有鲜明的共同特征：高投资率、出口导向、相对稳定的通胀以及积极利用国际金融市场。以泰国为例，其国内生产总值在这一时期年均增速长期维持在8%左右，马来西亚与印度尼西亚亦保持在6%至8%的区间，韩国在1990年代初仍具有7%以上的增长动能。从表面数据看，这些经济体似乎成功地将对外开放转化为长期发展优势。</w:t>
+        <w:t>1985年至1996年间，东亚多个经济体实现了持续的高速增长</w:t>
+      </w:r>
+      <w:r>
+        <w:rPr>
+          <w:rFonts w:hint="eastAsia" w:cs="宋体"/>
+          <w:b w:val="0"/>
+          <w:i w:val="0"/>
+          <w:sz w:val="21"/>
+          <w:lang w:eastAsia="zh-CN"/>
+        </w:rPr>
+        <w:t>，</w:t>
+      </w:r>
+      <w:r>
+        <w:rPr>
+          <w:rFonts w:ascii="宋体" w:hAnsi="宋体" w:eastAsia="宋体" w:cs="宋体"/>
+          <w:b w:val="0"/>
+          <w:i w:val="0"/>
+          <w:sz w:val="21"/>
+        </w:rPr>
+        <w:t>这一增长模式具有鲜明的共同特征：高投资率、出口导向、相对稳定的通胀以及积极利用国际金融市场。以泰国为例，其国内生产总值在这一时期年均增速长期维持在8%左右，马来西亚与印度尼西亚亦保持在6%至8%的区间，韩国在1990年代初仍具有7%以上的增长动能。从表面数据看，这些经济体似乎成功地将对外开放转化为长期发展优势。</w:t>
       </w:r>
     </w:p>
     <w:p>
@@ -93,7 +112,7 @@
           <w:i w:val="0"/>
           <w:sz w:val="21"/>
         </w:rPr>
-        <w:t>1.2 金融自由化、固定汇率与隐性担保</w:t>
+        <w:t>（二）金融自由化、固定汇率与道德风险</w:t>
       </w:r>
     </w:p>
     <w:p>
@@ -178,7 +197,7 @@
           <w:i w:val="0"/>
           <w:sz w:val="21"/>
         </w:rPr>
-        <w:t>2.1 泰国：第一代与第二代货币危机模型的交汇</w:t>
+        <w:t>（一）泰国：危机触发与货币崩溃</w:t>
       </w:r>
     </w:p>
     <w:p>
@@ -226,56 +245,12 @@
           <w:i w:val="0"/>
           <w:sz w:val="21"/>
         </w:rPr>
-        <w:t>2.2 传染、韩国与印度尼西亚的深度危机</w:t>
-      </w:r>
-    </w:p>
-    <w:p>
-      <w:r>
-        <w:rPr>
-          <w:rFonts w:ascii="宋体" w:hAnsi="宋体" w:eastAsia="宋体" w:cs="宋体"/>
-          <w:b w:val="0"/>
-          <w:i w:val="0"/>
-          <w:sz w:val="21"/>
-        </w:rPr>
-        <w:t>1997年下半年，危机迅速超越泰国国界。菲律宾在压力下允许比索贬值，马来西亚林吉特与印度尼西亚盾亦遭遇持续卖压。区域传染并不难以理解，其渠道至少包括三方面：其一，共同持有区域资产的国际投资者在面对不确定性上升时，往往同步削减整个新兴亚洲敞口，而非精细区分各国基本面；其二，一国货币贬值会降低其出口品相对价格，使贸易联系紧密的邻国出口企业面临更大竞争压力；市场由此形成邻国跟进贬值的预期，进而触发竞争性贬值的连锁反应；其三，信息不完全条件下，一国银行或主权问题会被投资者解读为对整个东亚模式的否定，从而触发更大范围的资本外流。</w:t>
-      </w:r>
-      <w:r>
-        <w:rPr>
-          <w:rFonts w:ascii="Segoe UI" w:hAnsi="Segoe UI" w:eastAsia="Segoe UI" w:cs="Segoe UI"/>
-          <w:i w:val="0"/>
-          <w:iCs w:val="0"/>
-          <w:caps w:val="0"/>
-          <w:spacing w:val="0"/>
-          <w:sz w:val="21"/>
-          <w:szCs w:val="21"/>
-          <w:shd w:val="clear" w:fill="F8F8F8"/>
-        </w:rPr>
-      </w:r>
-      <w:r>
-        <w:rPr>
-          <w:rFonts w:hint="eastAsia" w:ascii="Segoe UI" w:hAnsi="Segoe UI" w:cs="Segoe UI"/>
-          <w:i w:val="0"/>
-          <w:iCs w:val="0"/>
-          <w:caps w:val="0"/>
-          <w:spacing w:val="0"/>
-          <w:sz w:val="21"/>
-          <w:szCs w:val="21"/>
-          <w:shd w:val="clear" w:fill="F8F8F8"/>
-          <w:lang w:eastAsia="zh-CN"/>
-        </w:rPr>
-      </w:r>
-      <w:r>
-        <w:rPr>
-          <w:rFonts w:ascii="宋体" w:hAnsi="宋体" w:eastAsia="宋体" w:cs="宋体"/>
-          <w:b w:val="0"/>
-          <w:i w:val="0"/>
-          <w:sz w:val="21"/>
-        </w:rPr>
+        <w:t>（二）跨境传染：韩国与印度尼西亚</w:t>
       </w:r>
       <w:r>
         <w:rPr>
           <w:rFonts w:hint="eastAsia" w:cs="宋体"/>
-          <w:b w:val="0"/>
+          <w:b/>
           <w:i w:val="0"/>
           <w:sz w:val="21"/>
           <w:lang w:val="en-US" w:eastAsia="zh-CN"/>
@@ -284,7 +259,7 @@
       <w:r>
         <w:rPr>
           <w:rFonts w:ascii="宋体" w:hAnsi="宋体" w:eastAsia="宋体" w:cs="宋体"/>
-          <w:b w:val="0"/>
+          <w:b/>
           <w:i w:val="0"/>
           <w:sz w:val="21"/>
         </w:rPr>
@@ -298,9 +273,10 @@
           <w:i w:val="0"/>
           <w:sz w:val="21"/>
         </w:rPr>
-        <w:t>韩国在1997年上半年的表现，一度使部分观察者认为其可以免受最严重冲击。然而，这一判断低估了韩国银行体系对短期外债的依赖以及财阀过度扩张所积累的隐性风险。1997年1月韩宝钢铁破产已暴露出财阀治理与信贷软约束问题，同年10月前后起亚等大型企业又相继陷入财务困境，银行对少数企业集团的高度集中授信与公司治理失效由此充分暴露。外国银行随即拒绝为韩国商业银行续作短期贷款，韩国面临典型的流动性危机：即使部分银行长期资产质量尚未完全崩溃，批发融资渠道的突然中断已足以引发系统性挤兑。Diamond与Dybvig（1983）所描述的挤兑逻辑，在韩国则表现为国际银行间市场对外汇批发融资的集中抽贷。</w:t>
+        <w:t>1997年下半年，危机迅速超越泰国国界。菲律宾在压力下允许比索贬值，马来西亚林吉特与印度尼西亚盾亦遭遇持续卖压。区域传染并不难以理解，其渠道至少包括三方面：其一，共同持有区域资产的国际投资者在面对不确定性上升时，往往同步削减整个新兴亚洲敞口，而非精细区分各国基本面；其二，一国货币贬值会降低其出口品相对价格，使贸易联系紧密的邻国出口企业面临更大竞争压力；市场由此形成邻国跟进贬值的预期，进而触发竞争性贬值的连锁反应；其三，信息不完全条件下，一国银行或主权问题会被投资者解读为对整个东亚模式的否定，从而触发更大范围的资本外流。</w:t>
       </w:r>
-      <w:bookmarkStart w:id="0" w:name="_GoBack"/>
+    </w:p>
+    <w:p>
       <w:r>
         <w:rPr>
           <w:rFonts w:ascii="宋体" w:hAnsi="宋体" w:eastAsia="宋体" w:cs="宋体"/>
@@ -308,15 +284,7 @@
           <w:i w:val="0"/>
           <w:sz w:val="21"/>
         </w:rPr>
-      </w:r>
-      <w:bookmarkEnd w:id="0"/>
-      <w:r>
-        <w:rPr>
-          <w:rFonts w:ascii="宋体" w:hAnsi="宋体" w:eastAsia="宋体" w:cs="宋体"/>
-          <w:b w:val="0"/>
-          <w:i w:val="0"/>
-          <w:sz w:val="21"/>
-        </w:rPr>
+        <w:t>韩国在1997年上半年的表现，一度使部分观察者认为其可以免受最严重冲击。然而，这一判断低估了韩国银行体系对短期外债的依赖以及财阀过度扩张所积累的隐性风险。1997年1月韩宝钢铁破产已暴露出财阀治理与信贷软约束问题，同年10月前后起亚等大型企业又相继陷入财务困境，银行对少数企业集团的高度集中授信与公司治理失效由此充分暴露。外国银行随即拒绝为韩国商业银行续作短期贷款，韩国面临典型的流动性危机：即使部分银行长期资产质量尚未完全崩溃，批发融资渠道的突然中断已足以引发系统性挤兑。Diamond与Dybvig（1983）所描述的挤兑逻辑，在韩国则表现为国际银行间市场对外汇批发融资的集中抽贷。</w:t>
       </w:r>
     </w:p>
     <w:p>
@@ -353,7 +321,7 @@
           <w:i w:val="0"/>
           <w:sz w:val="21"/>
         </w:rPr>
-        <w:t>2.3 平息：重组、救助与差异化路径</w:t>
+        <w:t>（三）危机缓解与政策路径分化</w:t>
       </w:r>
     </w:p>
     <w:p>
@@ -416,7 +384,7 @@
           <w:i w:val="0"/>
           <w:sz w:val="21"/>
         </w:rPr>
-        <w:t>3.1 货币政策：捍卫汇率与维持国内金融稳定之间的冲突</w:t>
+        <w:t>（一）货币政策的两难困境</w:t>
       </w:r>
     </w:p>
     <w:p>
@@ -453,7 +421,7 @@
           <w:i w:val="0"/>
           <w:sz w:val="21"/>
         </w:rPr>
-        <w:t>3.2 财政政策与金融重组的财政成本</w:t>
+        <w:t>（二）财政政策与银行重组成本</w:t>
       </w:r>
     </w:p>
     <w:p>
@@ -490,7 +458,7 @@
           <w:i w:val="0"/>
           <w:sz w:val="21"/>
         </w:rPr>
-        <w:t>3.3 银行监管、存款担保与国际救助</w:t>
+        <w:t>（三）银行重组与国际救助</w:t>
       </w:r>
     </w:p>
     <w:p>
@@ -619,7 +587,7 @@
           <w:i w:val="0"/>
           <w:sz w:val="21"/>
         </w:rPr>
-        <w:t>五、本节小结</w:t>
+        <w:t>五、小结</w:t>
       </w:r>
     </w:p>
     <w:p>
@@ -654,6 +622,8 @@
         </w:rPr>
         <w:t>从成因上看，亚洲危机是货币、银行与国际因素在同一时间窗口内相互强化的结果，而非单一投机攻击或单一政策失误所能解释。对新兴市场经济体而言，其启示在于：金融开放须与监管能力、汇率制度及资本流动管理协调推进；金融稳定从来不是增长的自动副产品，而是需要持续维护的公共品。</w:t>
       </w:r>
+      <w:bookmarkStart w:id="0" w:name="_GoBack"/>
+      <w:bookmarkEnd w:id="0"/>
     </w:p>
     <w:p>
       <w:pPr>
@@ -672,7 +642,7 @@
     </w:p>
     <w:p>
       <w:pPr>
-        <w:spacing w:line="360" w:lineRule="auto" w:after="60"/>
+        <w:spacing w:after="60" w:line="360" w:lineRule="auto"/>
         <w:ind w:left="420" w:hanging="420"/>
         <w:rPr>
           <w:rFonts w:ascii="宋体" w:hAnsi="宋体" w:eastAsia="宋体" w:cs="宋体"/>
@@ -690,18 +660,10 @@
         </w:rPr>
         <w:t>Bernanke, B. S. (1983). Nonmonetary effects of the financial crisis in the propagation of the Great Depression. American Economic Review, 73(3), 257–276.</w:t>
       </w:r>
-      <w:r>
-        <w:rPr>
-          <w:rFonts w:ascii="宋体" w:hAnsi="宋体" w:eastAsia="宋体" w:cs="宋体"/>
-          <w:b w:val="0"/>
-          <w:i w:val="0"/>
-          <w:sz w:val="21"/>
-        </w:rPr>
-      </w:r>
     </w:p>
     <w:p>
       <w:pPr>
-        <w:spacing w:line="360" w:lineRule="auto" w:after="60"/>
+        <w:spacing w:after="60" w:line="360" w:lineRule="auto"/>
         <w:ind w:left="420" w:hanging="420"/>
         <w:rPr>
           <w:rFonts w:ascii="宋体" w:hAnsi="宋体" w:eastAsia="宋体" w:cs="宋体"/>
@@ -719,18 +681,10 @@
         </w:rPr>
         <w:t>Corsetti, G., Pesenti, P., &amp; Roubini, N. (1999). Paper tigers? A model of the Asian crisis. European Economic Review, 43(7), 1211–1236.</w:t>
       </w:r>
-      <w:r>
-        <w:rPr>
-          <w:rFonts w:ascii="宋体" w:hAnsi="宋体" w:eastAsia="宋体" w:cs="宋体"/>
-          <w:b w:val="0"/>
-          <w:i w:val="0"/>
-          <w:sz w:val="21"/>
-        </w:rPr>
-      </w:r>
     </w:p>
     <w:p>
       <w:pPr>
-        <w:spacing w:line="360" w:lineRule="auto" w:after="60"/>
+        <w:spacing w:after="60" w:line="360" w:lineRule="auto"/>
         <w:ind w:left="420" w:hanging="420"/>
         <w:rPr>
           <w:rFonts w:ascii="宋体" w:hAnsi="宋体" w:eastAsia="宋体" w:cs="宋体"/>
@@ -748,18 +702,10 @@
         </w:rPr>
         <w:t>Demirgüç-Kunt, A., &amp; Detragiache, E. (1999). Financial liberalization and financial fragility. In B. Pleskovic &amp; J. E. Stiglitz (Eds.), Annual World Bank Conference on Development Economics, 1998–1999 (pp. 303–316). World Bank.</w:t>
       </w:r>
-      <w:r>
-        <w:rPr>
-          <w:rFonts w:ascii="宋体" w:hAnsi="宋体" w:eastAsia="宋体" w:cs="宋体"/>
-          <w:b w:val="0"/>
-          <w:i w:val="0"/>
-          <w:sz w:val="21"/>
-        </w:rPr>
-      </w:r>
     </w:p>
     <w:p>
       <w:pPr>
-        <w:spacing w:line="360" w:lineRule="auto" w:after="60"/>
+        <w:spacing w:after="60" w:line="360" w:lineRule="auto"/>
         <w:ind w:left="420" w:hanging="420"/>
         <w:rPr>
           <w:rFonts w:ascii="宋体" w:hAnsi="宋体" w:eastAsia="宋体" w:cs="宋体"/>
@@ -777,18 +723,10 @@
         </w:rPr>
         <w:t>Diamond, D. W., &amp; Dybvig, P. H. (1983). Bank runs, deposit insurance, and liquidity. Journal of Political Economy, 91(3), 401–419.</w:t>
       </w:r>
-      <w:r>
-        <w:rPr>
-          <w:rFonts w:ascii="宋体" w:hAnsi="宋体" w:eastAsia="宋体" w:cs="宋体"/>
-          <w:b w:val="0"/>
-          <w:i w:val="0"/>
-          <w:sz w:val="21"/>
-        </w:rPr>
-      </w:r>
     </w:p>
     <w:p>
       <w:pPr>
-        <w:spacing w:line="360" w:lineRule="auto" w:after="60"/>
+        <w:spacing w:after="60" w:line="360" w:lineRule="auto"/>
         <w:ind w:left="420" w:hanging="420"/>
         <w:rPr>
           <w:rFonts w:ascii="宋体" w:hAnsi="宋体" w:eastAsia="宋体" w:cs="宋体"/>
@@ -806,18 +744,10 @@
         </w:rPr>
         <w:t>Eichengreen, B. (2002). Financial Crises and What to Do About Them. Oxford University Press.</w:t>
       </w:r>
-      <w:r>
-        <w:rPr>
-          <w:rFonts w:ascii="宋体" w:hAnsi="宋体" w:eastAsia="宋体" w:cs="宋体"/>
-          <w:b w:val="0"/>
-          <w:i w:val="0"/>
-          <w:sz w:val="21"/>
-        </w:rPr>
-      </w:r>
     </w:p>
     <w:p>
       <w:pPr>
-        <w:spacing w:line="360" w:lineRule="auto" w:after="60"/>
+        <w:spacing w:after="60" w:line="360" w:lineRule="auto"/>
         <w:ind w:left="420" w:hanging="420"/>
         <w:rPr>
           <w:rFonts w:ascii="宋体" w:hAnsi="宋体" w:eastAsia="宋体" w:cs="宋体"/>
@@ -835,18 +765,10 @@
         </w:rPr>
         <w:t>Fischer, S. (1998). The Asian crisis: A view from the IMF. Journal of International Money and Finance, 18(2), 167–175.</w:t>
       </w:r>
-      <w:r>
-        <w:rPr>
-          <w:rFonts w:ascii="宋体" w:hAnsi="宋体" w:eastAsia="宋体" w:cs="宋体"/>
-          <w:b w:val="0"/>
-          <w:i w:val="0"/>
-          <w:sz w:val="21"/>
-        </w:rPr>
-      </w:r>
     </w:p>
     <w:p>
       <w:pPr>
-        <w:spacing w:line="360" w:lineRule="auto" w:after="60"/>
+        <w:spacing w:after="60" w:line="360" w:lineRule="auto"/>
         <w:ind w:left="420" w:hanging="420"/>
         <w:rPr>
           <w:rFonts w:ascii="宋体" w:hAnsi="宋体" w:eastAsia="宋体" w:cs="宋体"/>
@@ -864,18 +786,10 @@
         </w:rPr>
         <w:t>Goldstein, M. (1998). The Asian Financial Crisis: Causes, Cures, and Systemic Implications. Peterson Institute for International Economics.</w:t>
       </w:r>
-      <w:r>
-        <w:rPr>
-          <w:rFonts w:ascii="宋体" w:hAnsi="宋体" w:eastAsia="宋体" w:cs="宋体"/>
-          <w:b w:val="0"/>
-          <w:i w:val="0"/>
-          <w:sz w:val="21"/>
-        </w:rPr>
-      </w:r>
     </w:p>
     <w:p>
       <w:pPr>
-        <w:spacing w:line="360" w:lineRule="auto" w:after="60"/>
+        <w:spacing w:after="60" w:line="360" w:lineRule="auto"/>
         <w:ind w:left="420" w:hanging="420"/>
         <w:rPr>
           <w:rFonts w:ascii="宋体" w:hAnsi="宋体" w:eastAsia="宋体" w:cs="宋体"/>
@@ -893,18 +807,10 @@
         </w:rPr>
         <w:t>Kindleberger, C. P. (1978). Manias, Panics, and Crashes: A History of Financial Crises. Basic Books.</w:t>
       </w:r>
-      <w:r>
-        <w:rPr>
-          <w:rFonts w:ascii="宋体" w:hAnsi="宋体" w:eastAsia="宋体" w:cs="宋体"/>
-          <w:b w:val="0"/>
-          <w:i w:val="0"/>
-          <w:sz w:val="21"/>
-        </w:rPr>
-      </w:r>
     </w:p>
     <w:p>
       <w:pPr>
-        <w:spacing w:line="360" w:lineRule="auto" w:after="60"/>
+        <w:spacing w:after="60" w:line="360" w:lineRule="auto"/>
         <w:ind w:left="420" w:hanging="420"/>
         <w:rPr>
           <w:rFonts w:ascii="宋体" w:hAnsi="宋体" w:eastAsia="宋体" w:cs="宋体"/>
@@ -922,18 +828,10 @@
         </w:rPr>
         <w:t>Krugman, P. (1979). A model of balance-of-payments crises. Journal of Money, Credit and Banking, 11(3), 311–325.</w:t>
       </w:r>
-      <w:r>
-        <w:rPr>
-          <w:rFonts w:ascii="宋体" w:hAnsi="宋体" w:eastAsia="宋体" w:cs="宋体"/>
-          <w:b w:val="0"/>
-          <w:i w:val="0"/>
-          <w:sz w:val="21"/>
-        </w:rPr>
-      </w:r>
     </w:p>
     <w:p>
       <w:pPr>
-        <w:spacing w:line="360" w:lineRule="auto" w:after="60"/>
+        <w:spacing w:after="60" w:line="360" w:lineRule="auto"/>
         <w:ind w:left="420" w:hanging="420"/>
         <w:rPr>
           <w:rFonts w:ascii="宋体" w:hAnsi="宋体" w:eastAsia="宋体" w:cs="宋体"/>
@@ -954,7 +852,7 @@
     </w:p>
     <w:p>
       <w:pPr>
-        <w:spacing w:line="360" w:lineRule="auto" w:after="60"/>
+        <w:spacing w:after="60" w:line="360" w:lineRule="auto"/>
         <w:ind w:left="420" w:hanging="420"/>
         <w:rPr>
           <w:rFonts w:ascii="宋体" w:hAnsi="宋体" w:eastAsia="宋体" w:cs="宋体"/>
@@ -972,18 +870,10 @@
         </w:rPr>
         <w:t>Lane, T., Ghosh, A. R., Hamann, J., Phillips, S., Schulze-Ghattas, M., &amp; Tsikata, T. (1999). IMF-supported programs in Indonesia, Korea, and Thailand: A preliminary assessment. IMF Occasional Paper No. 178. International Monetary Fund.</w:t>
       </w:r>
-      <w:r>
-        <w:rPr>
-          <w:rFonts w:ascii="宋体" w:hAnsi="宋体" w:eastAsia="宋体" w:cs="宋体"/>
-          <w:b w:val="0"/>
-          <w:i w:val="0"/>
-          <w:sz w:val="21"/>
-        </w:rPr>
-      </w:r>
     </w:p>
     <w:p>
       <w:pPr>
-        <w:spacing w:line="360" w:lineRule="auto" w:after="60"/>
+        <w:spacing w:after="60" w:line="360" w:lineRule="auto"/>
         <w:ind w:left="420" w:hanging="420"/>
         <w:rPr>
           <w:rFonts w:ascii="宋体" w:hAnsi="宋体" w:eastAsia="宋体" w:cs="宋体"/>
@@ -1001,18 +891,10 @@
         </w:rPr>
         <w:t>Minsky, H. P. (1986). Stabilizing an Unstable Economy. Yale University Press.</w:t>
       </w:r>
-      <w:r>
-        <w:rPr>
-          <w:rFonts w:ascii="宋体" w:hAnsi="宋体" w:eastAsia="宋体" w:cs="宋体"/>
-          <w:b w:val="0"/>
-          <w:i w:val="0"/>
-          <w:sz w:val="21"/>
-        </w:rPr>
-      </w:r>
     </w:p>
     <w:p>
       <w:pPr>
-        <w:spacing w:line="360" w:lineRule="auto" w:after="60"/>
+        <w:spacing w:after="60" w:line="360" w:lineRule="auto"/>
         <w:ind w:left="420" w:hanging="420"/>
         <w:rPr>
           <w:rFonts w:ascii="宋体" w:hAnsi="宋体" w:eastAsia="宋体" w:cs="宋体"/>
@@ -1030,18 +912,10 @@
         </w:rPr>
         <w:t>Obstfeld, M. (1994). The logic of currency crises. Cahiers Économiques et Monétaires, 43, 189–213.</w:t>
       </w:r>
-      <w:r>
-        <w:rPr>
-          <w:rFonts w:ascii="宋体" w:hAnsi="宋体" w:eastAsia="宋体" w:cs="宋体"/>
-          <w:b w:val="0"/>
-          <w:i w:val="0"/>
-          <w:sz w:val="21"/>
-        </w:rPr>
-      </w:r>
     </w:p>
     <w:p>
       <w:pPr>
-        <w:spacing w:line="360" w:lineRule="auto" w:after="60"/>
+        <w:spacing w:after="60" w:line="360" w:lineRule="auto"/>
         <w:ind w:left="420" w:hanging="420"/>
         <w:rPr>
           <w:rFonts w:ascii="宋体" w:hAnsi="宋体" w:eastAsia="宋体" w:cs="宋体"/>
@@ -1059,18 +933,10 @@
         </w:rPr>
         <w:t>Stiglitz, J. E. (2002). Globalization and Its Discontents. W. W. Norton.</w:t>
       </w:r>
-      <w:r>
-        <w:rPr>
-          <w:rFonts w:ascii="宋体" w:hAnsi="宋体" w:eastAsia="宋体" w:cs="宋体"/>
-          <w:b w:val="0"/>
-          <w:i w:val="0"/>
-          <w:sz w:val="21"/>
-        </w:rPr>
-      </w:r>
     </w:p>
     <w:p>
       <w:pPr>
-        <w:spacing w:line="360" w:lineRule="auto" w:after="60"/>
+        <w:spacing w:after="60" w:line="360" w:lineRule="auto"/>
         <w:ind w:left="420" w:hanging="420"/>
         <w:rPr>
           <w:rFonts w:ascii="宋体" w:hAnsi="宋体" w:eastAsia="宋体" w:cs="宋体"/>
@@ -1087,14 +953,6 @@
           <w:sz w:val="21"/>
         </w:rPr>
         <w:t>Stiglitz, J. E., &amp; Weiss, A. (1981). Credit rationing in markets with imperfect information. American Economic Review, 71(3), 393–410.</w:t>
-      </w:r>
-      <w:r>
-        <w:rPr>
-          <w:rFonts w:ascii="宋体" w:hAnsi="宋体" w:eastAsia="宋体" w:cs="宋体"/>
-          <w:b w:val="0"/>
-          <w:i w:val="0"/>
-          <w:sz w:val="21"/>
-        </w:rPr>
       </w:r>
     </w:p>
     <w:p>
@@ -1445,8 +1303,8 @@
     <w:lsdException w:uiPriority="99" w:name="Normal Indent"/>
     <w:lsdException w:uiPriority="99" w:name="footnote text"/>
     <w:lsdException w:uiPriority="99" w:name="annotation text"/>
-    <w:lsdException w:uiPriority="99" w:semiHidden="0" w:name="header"/>
-    <w:lsdException w:uiPriority="99" w:semiHidden="0" w:name="footer"/>
+    <w:lsdException w:qFormat="1" w:uiPriority="99" w:semiHidden="0" w:name="header"/>
+    <w:lsdException w:qFormat="1" w:uiPriority="99" w:semiHidden="0" w:name="footer"/>
     <w:lsdException w:uiPriority="99" w:name="index heading"/>
     <w:lsdException w:qFormat="1" w:uiPriority="35" w:name="caption"/>
     <w:lsdException w:uiPriority="99" w:name="table of figures"/>
@@ -1459,32 +1317,32 @@
     <w:lsdException w:uiPriority="99" w:name="endnote reference"/>
     <w:lsdException w:uiPriority="99" w:name="endnote text"/>
     <w:lsdException w:uiPriority="99" w:name="table of authorities"/>
-    <w:lsdException w:uiPriority="99" w:semiHidden="0" w:name="macro"/>
+    <w:lsdException w:qFormat="1" w:uiPriority="99" w:semiHidden="0" w:name="macro"/>
     <w:lsdException w:uiPriority="99" w:name="toa heading"/>
-    <w:lsdException w:uiPriority="99" w:semiHidden="0" w:name="List"/>
-    <w:lsdException w:uiPriority="99" w:semiHidden="0" w:name="List Bullet"/>
-    <w:lsdException w:uiPriority="99" w:semiHidden="0" w:name="List Number"/>
-    <w:lsdException w:uiPriority="99" w:semiHidden="0" w:name="List 2"/>
-    <w:lsdException w:uiPriority="99" w:semiHidden="0" w:name="List 3"/>
+    <w:lsdException w:qFormat="1" w:uiPriority="99" w:semiHidden="0" w:name="List"/>
+    <w:lsdException w:qFormat="1" w:uiPriority="99" w:semiHidden="0" w:name="List Bullet"/>
+    <w:lsdException w:qFormat="1" w:uiPriority="99" w:semiHidden="0" w:name="List Number"/>
+    <w:lsdException w:qFormat="1" w:uiPriority="99" w:semiHidden="0" w:name="List 2"/>
+    <w:lsdException w:qFormat="1" w:uiPriority="99" w:semiHidden="0" w:name="List 3"/>
     <w:lsdException w:uiPriority="99" w:name="List 4"/>
     <w:lsdException w:uiPriority="99" w:name="List 5"/>
-    <w:lsdException w:uiPriority="99" w:semiHidden="0" w:name="List Bullet 2"/>
-    <w:lsdException w:uiPriority="99" w:semiHidden="0" w:name="List Bullet 3"/>
+    <w:lsdException w:qFormat="1" w:uiPriority="99" w:semiHidden="0" w:name="List Bullet 2"/>
+    <w:lsdException w:qFormat="1" w:uiPriority="99" w:semiHidden="0" w:name="List Bullet 3"/>
     <w:lsdException w:uiPriority="99" w:name="List Bullet 4"/>
     <w:lsdException w:uiPriority="99" w:name="List Bullet 5"/>
-    <w:lsdException w:uiPriority="99" w:semiHidden="0" w:name="List Number 2"/>
-    <w:lsdException w:uiPriority="99" w:semiHidden="0" w:name="List Number 3"/>
+    <w:lsdException w:qFormat="1" w:uiPriority="99" w:semiHidden="0" w:name="List Number 2"/>
+    <w:lsdException w:qFormat="1" w:uiPriority="99" w:semiHidden="0" w:name="List Number 3"/>
     <w:lsdException w:uiPriority="99" w:name="List Number 4"/>
     <w:lsdException w:uiPriority="99" w:name="List Number 5"/>
     <w:lsdException w:qFormat="1" w:unhideWhenUsed="0" w:uiPriority="10" w:semiHidden="0" w:name="Title"/>
     <w:lsdException w:uiPriority="99" w:name="Closing"/>
     <w:lsdException w:uiPriority="99" w:name="Signature"/>
-    <w:lsdException w:uiPriority="1" w:name="Default Paragraph Font"/>
+    <w:lsdException w:qFormat="1" w:uiPriority="1" w:name="Default Paragraph Font"/>
     <w:lsdException w:qFormat="1" w:uiPriority="99" w:semiHidden="0" w:name="Body Text"/>
     <w:lsdException w:uiPriority="99" w:name="Body Text Indent"/>
-    <w:lsdException w:uiPriority="99" w:semiHidden="0" w:name="List Continue"/>
-    <w:lsdException w:uiPriority="99" w:semiHidden="0" w:name="List Continue 2"/>
-    <w:lsdException w:uiPriority="99" w:semiHidden="0" w:name="List Continue 3"/>
+    <w:lsdException w:qFormat="1" w:uiPriority="99" w:semiHidden="0" w:name="List Continue"/>
+    <w:lsdException w:qFormat="1" w:uiPriority="99" w:semiHidden="0" w:name="List Continue 2"/>
+    <w:lsdException w:qFormat="1" w:uiPriority="99" w:semiHidden="0" w:name="List Continue 3"/>
     <w:lsdException w:uiPriority="99" w:name="List Continue 4"/>
     <w:lsdException w:uiPriority="99" w:name="List Continue 5"/>
     <w:lsdException w:uiPriority="99" w:name="Message Header"/>
@@ -1494,8 +1352,8 @@
     <w:lsdException w:uiPriority="99" w:name="Body Text First Indent"/>
     <w:lsdException w:uiPriority="99" w:name="Body Text First Indent 2"/>
     <w:lsdException w:uiPriority="99" w:name="Note Heading"/>
-    <w:lsdException w:uiPriority="99" w:semiHidden="0" w:name="Body Text 2"/>
-    <w:lsdException w:uiPriority="99" w:semiHidden="0" w:name="Body Text 3"/>
+    <w:lsdException w:qFormat="1" w:uiPriority="99" w:semiHidden="0" w:name="Body Text 2"/>
+    <w:lsdException w:qFormat="1" w:uiPriority="99" w:semiHidden="0" w:name="Body Text 3"/>
     <w:lsdException w:uiPriority="99" w:name="Body Text Indent 2"/>
     <w:lsdException w:uiPriority="99" w:name="Body Text Indent 3"/>
     <w:lsdException w:uiPriority="99" w:name="Block Text"/>
@@ -1562,110 +1420,110 @@
     <w:lsdException w:uiPriority="99" w:name="Table Web 2"/>
     <w:lsdException w:uiPriority="99" w:name="Table Web 3"/>
     <w:lsdException w:uiPriority="99" w:name="Balloon Text"/>
-    <w:lsdException w:unhideWhenUsed="0" w:uiPriority="59" w:semiHidden="0" w:name="Table Grid"/>
+    <w:lsdException w:qFormat="1" w:unhideWhenUsed="0" w:uiPriority="59" w:semiHidden="0" w:name="Table Grid"/>
     <w:lsdException w:uiPriority="99" w:name="Table Theme"/>
     <w:lsdException w:qFormat="1" w:unhideWhenUsed="0" w:uiPriority="1" w:semiHidden="0" w:name="No Spacing"/>
-    <w:lsdException w:unhideWhenUsed="0" w:uiPriority="60" w:semiHidden="0" w:name="Light Shading"/>
-    <w:lsdException w:unhideWhenUsed="0" w:uiPriority="61" w:semiHidden="0" w:name="Light List"/>
-    <w:lsdException w:unhideWhenUsed="0" w:uiPriority="62" w:semiHidden="0" w:name="Light Grid"/>
-    <w:lsdException w:unhideWhenUsed="0" w:uiPriority="63" w:semiHidden="0" w:name="Medium Shading 1"/>
-    <w:lsdException w:unhideWhenUsed="0" w:uiPriority="64" w:semiHidden="0" w:name="Medium Shading 2"/>
-    <w:lsdException w:unhideWhenUsed="0" w:uiPriority="65" w:semiHidden="0" w:name="Medium List 1"/>
-    <w:lsdException w:unhideWhenUsed="0" w:uiPriority="66" w:semiHidden="0" w:name="Medium List 2"/>
-    <w:lsdException w:unhideWhenUsed="0" w:uiPriority="67" w:semiHidden="0" w:name="Medium Grid 1"/>
-    <w:lsdException w:unhideWhenUsed="0" w:uiPriority="68" w:semiHidden="0" w:name="Medium Grid 2"/>
+    <w:lsdException w:qFormat="1" w:unhideWhenUsed="0" w:uiPriority="60" w:semiHidden="0" w:name="Light Shading"/>
+    <w:lsdException w:qFormat="1" w:unhideWhenUsed="0" w:uiPriority="61" w:semiHidden="0" w:name="Light List"/>
+    <w:lsdException w:qFormat="1" w:unhideWhenUsed="0" w:uiPriority="62" w:semiHidden="0" w:name="Light Grid"/>
+    <w:lsdException w:qFormat="1" w:unhideWhenUsed="0" w:uiPriority="63" w:semiHidden="0" w:name="Medium Shading 1"/>
+    <w:lsdException w:qFormat="1" w:unhideWhenUsed="0" w:uiPriority="64" w:semiHidden="0" w:name="Medium Shading 2"/>
+    <w:lsdException w:qFormat="1" w:unhideWhenUsed="0" w:uiPriority="65" w:semiHidden="0" w:name="Medium List 1"/>
+    <w:lsdException w:qFormat="1" w:unhideWhenUsed="0" w:uiPriority="66" w:semiHidden="0" w:name="Medium List 2"/>
+    <w:lsdException w:qFormat="1" w:unhideWhenUsed="0" w:uiPriority="67" w:semiHidden="0" w:name="Medium Grid 1"/>
+    <w:lsdException w:qFormat="1" w:unhideWhenUsed="0" w:uiPriority="68" w:semiHidden="0" w:name="Medium Grid 2"/>
     <w:lsdException w:qFormat="1" w:unhideWhenUsed="0" w:uiPriority="69" w:semiHidden="0" w:name="Medium Grid 3"/>
     <w:lsdException w:qFormat="1" w:unhideWhenUsed="0" w:uiPriority="70" w:semiHidden="0" w:name="Dark List"/>
-    <w:lsdException w:unhideWhenUsed="0" w:uiPriority="71" w:semiHidden="0" w:name="Colorful Shading"/>
-    <w:lsdException w:unhideWhenUsed="0" w:uiPriority="72" w:semiHidden="0" w:name="Colorful List"/>
-    <w:lsdException w:unhideWhenUsed="0" w:uiPriority="73" w:semiHidden="0" w:name="Colorful Grid"/>
-    <w:lsdException w:unhideWhenUsed="0" w:uiPriority="60" w:semiHidden="0" w:name="Light Shading Accent 1"/>
-    <w:lsdException w:unhideWhenUsed="0" w:uiPriority="61" w:semiHidden="0" w:name="Light List Accent 1"/>
-    <w:lsdException w:unhideWhenUsed="0" w:uiPriority="62" w:semiHidden="0" w:name="Light Grid Accent 1"/>
-    <w:lsdException w:unhideWhenUsed="0" w:uiPriority="63" w:semiHidden="0" w:name="Medium Shading 1 Accent 1"/>
-    <w:lsdException w:unhideWhenUsed="0" w:uiPriority="64" w:semiHidden="0" w:name="Medium Shading 2 Accent 1"/>
-    <w:lsdException w:unhideWhenUsed="0" w:uiPriority="65" w:semiHidden="0" w:name="Medium List 1 Accent 1"/>
+    <w:lsdException w:qFormat="1" w:unhideWhenUsed="0" w:uiPriority="71" w:semiHidden="0" w:name="Colorful Shading"/>
+    <w:lsdException w:qFormat="1" w:unhideWhenUsed="0" w:uiPriority="72" w:semiHidden="0" w:name="Colorful List"/>
+    <w:lsdException w:qFormat="1" w:unhideWhenUsed="0" w:uiPriority="73" w:semiHidden="0" w:name="Colorful Grid"/>
+    <w:lsdException w:qFormat="1" w:unhideWhenUsed="0" w:uiPriority="60" w:semiHidden="0" w:name="Light Shading Accent 1"/>
+    <w:lsdException w:qFormat="1" w:unhideWhenUsed="0" w:uiPriority="61" w:semiHidden="0" w:name="Light List Accent 1"/>
+    <w:lsdException w:qFormat="1" w:unhideWhenUsed="0" w:uiPriority="62" w:semiHidden="0" w:name="Light Grid Accent 1"/>
+    <w:lsdException w:qFormat="1" w:unhideWhenUsed="0" w:uiPriority="63" w:semiHidden="0" w:name="Medium Shading 1 Accent 1"/>
+    <w:lsdException w:qFormat="1" w:unhideWhenUsed="0" w:uiPriority="64" w:semiHidden="0" w:name="Medium Shading 2 Accent 1"/>
+    <w:lsdException w:qFormat="1" w:unhideWhenUsed="0" w:uiPriority="65" w:semiHidden="0" w:name="Medium List 1 Accent 1"/>
     <w:lsdException w:qFormat="1" w:unhideWhenUsed="0" w:uiPriority="34" w:semiHidden="0" w:name="List Paragraph"/>
     <w:lsdException w:qFormat="1" w:unhideWhenUsed="0" w:uiPriority="29" w:semiHidden="0" w:name="Quote"/>
     <w:lsdException w:qFormat="1" w:unhideWhenUsed="0" w:uiPriority="30" w:semiHidden="0" w:name="Intense Quote"/>
-    <w:lsdException w:unhideWhenUsed="0" w:uiPriority="66" w:semiHidden="0" w:name="Medium List 2 Accent 1"/>
+    <w:lsdException w:qFormat="1" w:unhideWhenUsed="0" w:uiPriority="66" w:semiHidden="0" w:name="Medium List 2 Accent 1"/>
     <w:lsdException w:qFormat="1" w:unhideWhenUsed="0" w:uiPriority="67" w:semiHidden="0" w:name="Medium Grid 1 Accent 1"/>
-    <w:lsdException w:unhideWhenUsed="0" w:uiPriority="68" w:semiHidden="0" w:name="Medium Grid 2 Accent 1"/>
+    <w:lsdException w:qFormat="1" w:unhideWhenUsed="0" w:uiPriority="68" w:semiHidden="0" w:name="Medium Grid 2 Accent 1"/>
     <w:lsdException w:qFormat="1" w:unhideWhenUsed="0" w:uiPriority="69" w:semiHidden="0" w:name="Medium Grid 3 Accent 1"/>
     <w:lsdException w:qFormat="1" w:unhideWhenUsed="0" w:uiPriority="70" w:semiHidden="0" w:name="Dark List Accent 1"/>
-    <w:lsdException w:unhideWhenUsed="0" w:uiPriority="71" w:semiHidden="0" w:name="Colorful Shading Accent 1"/>
-    <w:lsdException w:unhideWhenUsed="0" w:uiPriority="72" w:semiHidden="0" w:name="Colorful List Accent 1"/>
-    <w:lsdException w:unhideWhenUsed="0" w:uiPriority="73" w:semiHidden="0" w:name="Colorful Grid Accent 1"/>
-    <w:lsdException w:unhideWhenUsed="0" w:uiPriority="60" w:semiHidden="0" w:name="Light Shading Accent 2"/>
-    <w:lsdException w:unhideWhenUsed="0" w:uiPriority="61" w:semiHidden="0" w:name="Light List Accent 2"/>
-    <w:lsdException w:unhideWhenUsed="0" w:uiPriority="62" w:semiHidden="0" w:name="Light Grid Accent 2"/>
-    <w:lsdException w:unhideWhenUsed="0" w:uiPriority="63" w:semiHidden="0" w:name="Medium Shading 1 Accent 2"/>
-    <w:lsdException w:unhideWhenUsed="0" w:uiPriority="64" w:semiHidden="0" w:name="Medium Shading 2 Accent 2"/>
-    <w:lsdException w:unhideWhenUsed="0" w:uiPriority="65" w:semiHidden="0" w:name="Medium List 1 Accent 2"/>
-    <w:lsdException w:unhideWhenUsed="0" w:uiPriority="66" w:semiHidden="0" w:name="Medium List 2 Accent 2"/>
-    <w:lsdException w:unhideWhenUsed="0" w:uiPriority="67" w:semiHidden="0" w:name="Medium Grid 1 Accent 2"/>
-    <w:lsdException w:unhideWhenUsed="0" w:uiPriority="68" w:semiHidden="0" w:name="Medium Grid 2 Accent 2"/>
+    <w:lsdException w:qFormat="1" w:unhideWhenUsed="0" w:uiPriority="71" w:semiHidden="0" w:name="Colorful Shading Accent 1"/>
+    <w:lsdException w:qFormat="1" w:unhideWhenUsed="0" w:uiPriority="72" w:semiHidden="0" w:name="Colorful List Accent 1"/>
+    <w:lsdException w:qFormat="1" w:unhideWhenUsed="0" w:uiPriority="73" w:semiHidden="0" w:name="Colorful Grid Accent 1"/>
+    <w:lsdException w:qFormat="1" w:unhideWhenUsed="0" w:uiPriority="60" w:semiHidden="0" w:name="Light Shading Accent 2"/>
+    <w:lsdException w:qFormat="1" w:unhideWhenUsed="0" w:uiPriority="61" w:semiHidden="0" w:name="Light List Accent 2"/>
+    <w:lsdException w:qFormat="1" w:unhideWhenUsed="0" w:uiPriority="62" w:semiHidden="0" w:name="Light Grid Accent 2"/>
+    <w:lsdException w:qFormat="1" w:unhideWhenUsed="0" w:uiPriority="63" w:semiHidden="0" w:name="Medium Shading 1 Accent 2"/>
+    <w:lsdException w:qFormat="1" w:unhideWhenUsed="0" w:uiPriority="64" w:semiHidden="0" w:name="Medium Shading 2 Accent 2"/>
+    <w:lsdException w:qFormat="1" w:unhideWhenUsed="0" w:uiPriority="65" w:semiHidden="0" w:name="Medium List 1 Accent 2"/>
+    <w:lsdException w:qFormat="1" w:unhideWhenUsed="0" w:uiPriority="66" w:semiHidden="0" w:name="Medium List 2 Accent 2"/>
+    <w:lsdException w:qFormat="1" w:unhideWhenUsed="0" w:uiPriority="67" w:semiHidden="0" w:name="Medium Grid 1 Accent 2"/>
+    <w:lsdException w:qFormat="1" w:unhideWhenUsed="0" w:uiPriority="68" w:semiHidden="0" w:name="Medium Grid 2 Accent 2"/>
     <w:lsdException w:qFormat="1" w:unhideWhenUsed="0" w:uiPriority="69" w:semiHidden="0" w:name="Medium Grid 3 Accent 2"/>
-    <w:lsdException w:unhideWhenUsed="0" w:uiPriority="70" w:semiHidden="0" w:name="Dark List Accent 2"/>
-    <w:lsdException w:unhideWhenUsed="0" w:uiPriority="71" w:semiHidden="0" w:name="Colorful Shading Accent 2"/>
-    <w:lsdException w:unhideWhenUsed="0" w:uiPriority="72" w:semiHidden="0" w:name="Colorful List Accent 2"/>
-    <w:lsdException w:unhideWhenUsed="0" w:uiPriority="73" w:semiHidden="0" w:name="Colorful Grid Accent 2"/>
-    <w:lsdException w:unhideWhenUsed="0" w:uiPriority="60" w:semiHidden="0" w:name="Light Shading Accent 3"/>
-    <w:lsdException w:unhideWhenUsed="0" w:uiPriority="61" w:semiHidden="0" w:name="Light List Accent 3"/>
-    <w:lsdException w:unhideWhenUsed="0" w:uiPriority="62" w:semiHidden="0" w:name="Light Grid Accent 3"/>
-    <w:lsdException w:unhideWhenUsed="0" w:uiPriority="63" w:semiHidden="0" w:name="Medium Shading 1 Accent 3"/>
-    <w:lsdException w:unhideWhenUsed="0" w:uiPriority="64" w:semiHidden="0" w:name="Medium Shading 2 Accent 3"/>
-    <w:lsdException w:unhideWhenUsed="0" w:uiPriority="65" w:semiHidden="0" w:name="Medium List 1 Accent 3"/>
+    <w:lsdException w:qFormat="1" w:unhideWhenUsed="0" w:uiPriority="70" w:semiHidden="0" w:name="Dark List Accent 2"/>
+    <w:lsdException w:qFormat="1" w:unhideWhenUsed="0" w:uiPriority="71" w:semiHidden="0" w:name="Colorful Shading Accent 2"/>
+    <w:lsdException w:qFormat="1" w:unhideWhenUsed="0" w:uiPriority="72" w:semiHidden="0" w:name="Colorful List Accent 2"/>
+    <w:lsdException w:qFormat="1" w:unhideWhenUsed="0" w:uiPriority="73" w:semiHidden="0" w:name="Colorful Grid Accent 2"/>
+    <w:lsdException w:qFormat="1" w:unhideWhenUsed="0" w:uiPriority="60" w:semiHidden="0" w:name="Light Shading Accent 3"/>
+    <w:lsdException w:qFormat="1" w:unhideWhenUsed="0" w:uiPriority="61" w:semiHidden="0" w:name="Light List Accent 3"/>
+    <w:lsdException w:qFormat="1" w:unhideWhenUsed="0" w:uiPriority="62" w:semiHidden="0" w:name="Light Grid Accent 3"/>
+    <w:lsdException w:qFormat="1" w:unhideWhenUsed="0" w:uiPriority="63" w:semiHidden="0" w:name="Medium Shading 1 Accent 3"/>
+    <w:lsdException w:qFormat="1" w:unhideWhenUsed="0" w:uiPriority="64" w:semiHidden="0" w:name="Medium Shading 2 Accent 3"/>
+    <w:lsdException w:qFormat="1" w:unhideWhenUsed="0" w:uiPriority="65" w:semiHidden="0" w:name="Medium List 1 Accent 3"/>
     <w:lsdException w:unhideWhenUsed="0" w:uiPriority="66" w:semiHidden="0" w:name="Medium List 2 Accent 3"/>
     <w:lsdException w:qFormat="1" w:unhideWhenUsed="0" w:uiPriority="67" w:semiHidden="0" w:name="Medium Grid 1 Accent 3"/>
-    <w:lsdException w:unhideWhenUsed="0" w:uiPriority="68" w:semiHidden="0" w:name="Medium Grid 2 Accent 3"/>
-    <w:lsdException w:unhideWhenUsed="0" w:uiPriority="69" w:semiHidden="0" w:name="Medium Grid 3 Accent 3"/>
-    <w:lsdException w:unhideWhenUsed="0" w:uiPriority="70" w:semiHidden="0" w:name="Dark List Accent 3"/>
-    <w:lsdException w:unhideWhenUsed="0" w:uiPriority="71" w:semiHidden="0" w:name="Colorful Shading Accent 3"/>
-    <w:lsdException w:unhideWhenUsed="0" w:uiPriority="72" w:semiHidden="0" w:name="Colorful List Accent 3"/>
-    <w:lsdException w:unhideWhenUsed="0" w:uiPriority="73" w:semiHidden="0" w:name="Colorful Grid Accent 3"/>
-    <w:lsdException w:unhideWhenUsed="0" w:uiPriority="60" w:semiHidden="0" w:name="Light Shading Accent 4"/>
-    <w:lsdException w:unhideWhenUsed="0" w:uiPriority="61" w:semiHidden="0" w:name="Light List Accent 4"/>
-    <w:lsdException w:unhideWhenUsed="0" w:uiPriority="62" w:semiHidden="0" w:name="Light Grid Accent 4"/>
-    <w:lsdException w:unhideWhenUsed="0" w:uiPriority="63" w:semiHidden="0" w:name="Medium Shading 1 Accent 4"/>
-    <w:lsdException w:unhideWhenUsed="0" w:uiPriority="64" w:semiHidden="0" w:name="Medium Shading 2 Accent 4"/>
-    <w:lsdException w:unhideWhenUsed="0" w:uiPriority="65" w:semiHidden="0" w:name="Medium List 1 Accent 4"/>
-    <w:lsdException w:unhideWhenUsed="0" w:uiPriority="66" w:semiHidden="0" w:name="Medium List 2 Accent 4"/>
-    <w:lsdException w:unhideWhenUsed="0" w:uiPriority="67" w:semiHidden="0" w:name="Medium Grid 1 Accent 4"/>
+    <w:lsdException w:qFormat="1" w:unhideWhenUsed="0" w:uiPriority="68" w:semiHidden="0" w:name="Medium Grid 2 Accent 3"/>
+    <w:lsdException w:qFormat="1" w:unhideWhenUsed="0" w:uiPriority="69" w:semiHidden="0" w:name="Medium Grid 3 Accent 3"/>
+    <w:lsdException w:qFormat="1" w:unhideWhenUsed="0" w:uiPriority="70" w:semiHidden="0" w:name="Dark List Accent 3"/>
+    <w:lsdException w:qFormat="1" w:unhideWhenUsed="0" w:uiPriority="71" w:semiHidden="0" w:name="Colorful Shading Accent 3"/>
+    <w:lsdException w:qFormat="1" w:unhideWhenUsed="0" w:uiPriority="72" w:semiHidden="0" w:name="Colorful List Accent 3"/>
+    <w:lsdException w:qFormat="1" w:unhideWhenUsed="0" w:uiPriority="73" w:semiHidden="0" w:name="Colorful Grid Accent 3"/>
+    <w:lsdException w:qFormat="1" w:unhideWhenUsed="0" w:uiPriority="60" w:semiHidden="0" w:name="Light Shading Accent 4"/>
+    <w:lsdException w:qFormat="1" w:unhideWhenUsed="0" w:uiPriority="61" w:semiHidden="0" w:name="Light List Accent 4"/>
+    <w:lsdException w:qFormat="1" w:unhideWhenUsed="0" w:uiPriority="62" w:semiHidden="0" w:name="Light Grid Accent 4"/>
+    <w:lsdException w:qFormat="1" w:unhideWhenUsed="0" w:uiPriority="63" w:semiHidden="0" w:name="Medium Shading 1 Accent 4"/>
+    <w:lsdException w:qFormat="1" w:unhideWhenUsed="0" w:uiPriority="64" w:semiHidden="0" w:name="Medium Shading 2 Accent 4"/>
+    <w:lsdException w:qFormat="1" w:unhideWhenUsed="0" w:uiPriority="65" w:semiHidden="0" w:name="Medium List 1 Accent 4"/>
+    <w:lsdException w:qFormat="1" w:unhideWhenUsed="0" w:uiPriority="66" w:semiHidden="0" w:name="Medium List 2 Accent 4"/>
+    <w:lsdException w:qFormat="1" w:unhideWhenUsed="0" w:uiPriority="67" w:semiHidden="0" w:name="Medium Grid 1 Accent 4"/>
     <w:lsdException w:qFormat="1" w:unhideWhenUsed="0" w:uiPriority="68" w:semiHidden="0" w:name="Medium Grid 2 Accent 4"/>
-    <w:lsdException w:unhideWhenUsed="0" w:uiPriority="69" w:semiHidden="0" w:name="Medium Grid 3 Accent 4"/>
-    <w:lsdException w:unhideWhenUsed="0" w:uiPriority="70" w:semiHidden="0" w:name="Dark List Accent 4"/>
-    <w:lsdException w:unhideWhenUsed="0" w:uiPriority="71" w:semiHidden="0" w:name="Colorful Shading Accent 4"/>
-    <w:lsdException w:unhideWhenUsed="0" w:uiPriority="72" w:semiHidden="0" w:name="Colorful List Accent 4"/>
-    <w:lsdException w:unhideWhenUsed="0" w:uiPriority="73" w:semiHidden="0" w:name="Colorful Grid Accent 4"/>
-    <w:lsdException w:unhideWhenUsed="0" w:uiPriority="60" w:semiHidden="0" w:name="Light Shading Accent 5"/>
-    <w:lsdException w:unhideWhenUsed="0" w:uiPriority="61" w:semiHidden="0" w:name="Light List Accent 5"/>
-    <w:lsdException w:unhideWhenUsed="0" w:uiPriority="62" w:semiHidden="0" w:name="Light Grid Accent 5"/>
-    <w:lsdException w:unhideWhenUsed="0" w:uiPriority="63" w:semiHidden="0" w:name="Medium Shading 1 Accent 5"/>
-    <w:lsdException w:unhideWhenUsed="0" w:uiPriority="64" w:semiHidden="0" w:name="Medium Shading 2 Accent 5"/>
-    <w:lsdException w:unhideWhenUsed="0" w:uiPriority="65" w:semiHidden="0" w:name="Medium List 1 Accent 5"/>
+    <w:lsdException w:qFormat="1" w:unhideWhenUsed="0" w:uiPriority="69" w:semiHidden="0" w:name="Medium Grid 3 Accent 4"/>
+    <w:lsdException w:qFormat="1" w:unhideWhenUsed="0" w:uiPriority="70" w:semiHidden="0" w:name="Dark List Accent 4"/>
+    <w:lsdException w:qFormat="1" w:unhideWhenUsed="0" w:uiPriority="71" w:semiHidden="0" w:name="Colorful Shading Accent 4"/>
+    <w:lsdException w:qFormat="1" w:unhideWhenUsed="0" w:uiPriority="72" w:semiHidden="0" w:name="Colorful List Accent 4"/>
+    <w:lsdException w:qFormat="1" w:unhideWhenUsed="0" w:uiPriority="73" w:semiHidden="0" w:name="Colorful Grid Accent 4"/>
+    <w:lsdException w:qFormat="1" w:unhideWhenUsed="0" w:uiPriority="60" w:semiHidden="0" w:name="Light Shading Accent 5"/>
+    <w:lsdException w:qFormat="1" w:unhideWhenUsed="0" w:uiPriority="61" w:semiHidden="0" w:name="Light List Accent 5"/>
+    <w:lsdException w:qFormat="1" w:unhideWhenUsed="0" w:uiPriority="62" w:semiHidden="0" w:name="Light Grid Accent 5"/>
+    <w:lsdException w:qFormat="1" w:unhideWhenUsed="0" w:uiPriority="63" w:semiHidden="0" w:name="Medium Shading 1 Accent 5"/>
+    <w:lsdException w:qFormat="1" w:unhideWhenUsed="0" w:uiPriority="64" w:semiHidden="0" w:name="Medium Shading 2 Accent 5"/>
+    <w:lsdException w:qFormat="1" w:unhideWhenUsed="0" w:uiPriority="65" w:semiHidden="0" w:name="Medium List 1 Accent 5"/>
     <w:lsdException w:qFormat="1" w:unhideWhenUsed="0" w:uiPriority="66" w:semiHidden="0" w:name="Medium List 2 Accent 5"/>
-    <w:lsdException w:unhideWhenUsed="0" w:uiPriority="67" w:semiHidden="0" w:name="Medium Grid 1 Accent 5"/>
-    <w:lsdException w:unhideWhenUsed="0" w:uiPriority="68" w:semiHidden="0" w:name="Medium Grid 2 Accent 5"/>
-    <w:lsdException w:unhideWhenUsed="0" w:uiPriority="69" w:semiHidden="0" w:name="Medium Grid 3 Accent 5"/>
-    <w:lsdException w:unhideWhenUsed="0" w:uiPriority="70" w:semiHidden="0" w:name="Dark List Accent 5"/>
-    <w:lsdException w:unhideWhenUsed="0" w:uiPriority="71" w:semiHidden="0" w:name="Colorful Shading Accent 5"/>
-    <w:lsdException w:unhideWhenUsed="0" w:uiPriority="72" w:semiHidden="0" w:name="Colorful List Accent 5"/>
-    <w:lsdException w:unhideWhenUsed="0" w:uiPriority="73" w:semiHidden="0" w:name="Colorful Grid Accent 5"/>
-    <w:lsdException w:unhideWhenUsed="0" w:uiPriority="60" w:semiHidden="0" w:name="Light Shading Accent 6"/>
-    <w:lsdException w:unhideWhenUsed="0" w:uiPriority="61" w:semiHidden="0" w:name="Light List Accent 6"/>
-    <w:lsdException w:unhideWhenUsed="0" w:uiPriority="62" w:semiHidden="0" w:name="Light Grid Accent 6"/>
-    <w:lsdException w:unhideWhenUsed="0" w:uiPriority="63" w:semiHidden="0" w:name="Medium Shading 1 Accent 6"/>
-    <w:lsdException w:unhideWhenUsed="0" w:uiPriority="64" w:semiHidden="0" w:name="Medium Shading 2 Accent 6"/>
-    <w:lsdException w:unhideWhenUsed="0" w:uiPriority="65" w:semiHidden="0" w:name="Medium List 1 Accent 6"/>
-    <w:lsdException w:unhideWhenUsed="0" w:uiPriority="66" w:semiHidden="0" w:name="Medium List 2 Accent 6"/>
+    <w:lsdException w:qFormat="1" w:unhideWhenUsed="0" w:uiPriority="67" w:semiHidden="0" w:name="Medium Grid 1 Accent 5"/>
+    <w:lsdException w:qFormat="1" w:unhideWhenUsed="0" w:uiPriority="68" w:semiHidden="0" w:name="Medium Grid 2 Accent 5"/>
+    <w:lsdException w:qFormat="1" w:unhideWhenUsed="0" w:uiPriority="69" w:semiHidden="0" w:name="Medium Grid 3 Accent 5"/>
+    <w:lsdException w:qFormat="1" w:unhideWhenUsed="0" w:uiPriority="70" w:semiHidden="0" w:name="Dark List Accent 5"/>
+    <w:lsdException w:qFormat="1" w:unhideWhenUsed="0" w:uiPriority="71" w:semiHidden="0" w:name="Colorful Shading Accent 5"/>
+    <w:lsdException w:qFormat="1" w:unhideWhenUsed="0" w:uiPriority="72" w:semiHidden="0" w:name="Colorful List Accent 5"/>
+    <w:lsdException w:qFormat="1" w:unhideWhenUsed="0" w:uiPriority="73" w:semiHidden="0" w:name="Colorful Grid Accent 5"/>
+    <w:lsdException w:qFormat="1" w:unhideWhenUsed="0" w:uiPriority="60" w:semiHidden="0" w:name="Light Shading Accent 6"/>
+    <w:lsdException w:qFormat="1" w:unhideWhenUsed="0" w:uiPriority="61" w:semiHidden="0" w:name="Light List Accent 6"/>
+    <w:lsdException w:qFormat="1" w:unhideWhenUsed="0" w:uiPriority="62" w:semiHidden="0" w:name="Light Grid Accent 6"/>
+    <w:lsdException w:qFormat="1" w:unhideWhenUsed="0" w:uiPriority="63" w:semiHidden="0" w:name="Medium Shading 1 Accent 6"/>
+    <w:lsdException w:qFormat="1" w:unhideWhenUsed="0" w:uiPriority="64" w:semiHidden="0" w:name="Medium Shading 2 Accent 6"/>
+    <w:lsdException w:qFormat="1" w:unhideWhenUsed="0" w:uiPriority="65" w:semiHidden="0" w:name="Medium List 1 Accent 6"/>
+    <w:lsdException w:qFormat="1" w:unhideWhenUsed="0" w:uiPriority="66" w:semiHidden="0" w:name="Medium List 2 Accent 6"/>
     <w:lsdException w:qFormat="1" w:unhideWhenUsed="0" w:uiPriority="67" w:semiHidden="0" w:name="Medium Grid 1 Accent 6"/>
     <w:lsdException w:qFormat="1" w:unhideWhenUsed="0" w:uiPriority="68" w:semiHidden="0" w:name="Medium Grid 2 Accent 6"/>
     <w:lsdException w:qFormat="1" w:unhideWhenUsed="0" w:uiPriority="69" w:semiHidden="0" w:name="Medium Grid 3 Accent 6"/>
-    <w:lsdException w:unhideWhenUsed="0" w:uiPriority="70" w:semiHidden="0" w:name="Dark List Accent 6"/>
-    <w:lsdException w:unhideWhenUsed="0" w:uiPriority="71" w:semiHidden="0" w:name="Colorful Shading Accent 6"/>
-    <w:lsdException w:unhideWhenUsed="0" w:uiPriority="72" w:semiHidden="0" w:name="Colorful List Accent 6"/>
-    <w:lsdException w:unhideWhenUsed="0" w:uiPriority="73" w:semiHidden="0" w:name="Colorful Grid Accent 6"/>
+    <w:lsdException w:qFormat="1" w:unhideWhenUsed="0" w:uiPriority="70" w:semiHidden="0" w:name="Dark List Accent 6"/>
+    <w:lsdException w:qFormat="1" w:unhideWhenUsed="0" w:uiPriority="71" w:semiHidden="0" w:name="Colorful Shading Accent 6"/>
+    <w:lsdException w:qFormat="1" w:unhideWhenUsed="0" w:uiPriority="72" w:semiHidden="0" w:name="Colorful List Accent 6"/>
+    <w:lsdException w:qFormat="1" w:unhideWhenUsed="0" w:uiPriority="73" w:semiHidden="0" w:name="Colorful Grid Accent 6"/>
   </w:latentStyles>
   <w:style w:type="paragraph" w:default="1" w:styleId="1">
     <w:name w:val="Normal"/>
@@ -1922,6 +1780,7 @@
     <w:name w:val="Default Paragraph Font"/>
     <w:semiHidden/>
     <w:unhideWhenUsed/>
+    <w:qFormat/>
     <w:uiPriority w:val="1"/>
   </w:style>
   <w:style w:type="table" w:default="1" w:styleId="32">
@@ -1943,6 +1802,7 @@
     <w:name w:val="macro"/>
     <w:link w:val="147"/>
     <w:unhideWhenUsed/>
+    <w:qFormat/>
     <w:uiPriority w:val="99"/>
     <w:pPr>
       <w:tabs>
@@ -1967,6 +1827,7 @@
     <w:name w:val="List 3"/>
     <w:basedOn w:val="1"/>
     <w:unhideWhenUsed/>
+    <w:qFormat/>
     <w:uiPriority w:val="99"/>
     <w:pPr>
       <w:ind w:left="1080" w:hanging="360"/>
@@ -1977,6 +1838,7 @@
     <w:name w:val="List Number 2"/>
     <w:basedOn w:val="1"/>
     <w:unhideWhenUsed/>
+    <w:qFormat/>
     <w:uiPriority w:val="99"/>
     <w:pPr>
       <w:numPr>
@@ -1990,6 +1852,7 @@
     <w:name w:val="List Number"/>
     <w:basedOn w:val="1"/>
     <w:unhideWhenUsed/>
+    <w:qFormat/>
     <w:uiPriority w:val="99"/>
     <w:pPr>
       <w:numPr>
@@ -2027,6 +1890,7 @@
     <w:name w:val="List Bullet"/>
     <w:basedOn w:val="1"/>
     <w:unhideWhenUsed/>
+    <w:qFormat/>
     <w:uiPriority w:val="99"/>
     <w:pPr>
       <w:numPr>
@@ -2041,6 +1905,7 @@
     <w:basedOn w:val="1"/>
     <w:link w:val="146"/>
     <w:unhideWhenUsed/>
+    <w:qFormat/>
     <w:uiPriority w:val="99"/>
     <w:pPr>
       <w:spacing w:after="120"/>
@@ -2054,6 +1919,7 @@
     <w:name w:val="List Bullet 3"/>
     <w:basedOn w:val="1"/>
     <w:unhideWhenUsed/>
+    <w:qFormat/>
     <w:uiPriority w:val="99"/>
     <w:pPr>
       <w:numPr>
@@ -2078,6 +1944,7 @@
     <w:name w:val="List Number 3"/>
     <w:basedOn w:val="1"/>
     <w:unhideWhenUsed/>
+    <w:qFormat/>
     <w:uiPriority w:val="99"/>
     <w:pPr>
       <w:numPr>
@@ -2091,6 +1958,7 @@
     <w:name w:val="List 2"/>
     <w:basedOn w:val="1"/>
     <w:unhideWhenUsed/>
+    <w:qFormat/>
     <w:uiPriority w:val="99"/>
     <w:pPr>
       <w:ind w:left="720" w:hanging="360"/>
@@ -2101,6 +1969,7 @@
     <w:name w:val="List Continue"/>
     <w:basedOn w:val="1"/>
     <w:unhideWhenUsed/>
+    <w:qFormat/>
     <w:uiPriority w:val="99"/>
     <w:pPr>
       <w:spacing w:after="120"/>
@@ -2112,6 +1981,7 @@
     <w:name w:val="List Bullet 2"/>
     <w:basedOn w:val="1"/>
     <w:unhideWhenUsed/>
+    <w:qFormat/>
     <w:uiPriority w:val="99"/>
     <w:pPr>
       <w:numPr>
@@ -2126,6 +1996,7 @@
     <w:basedOn w:val="1"/>
     <w:link w:val="136"/>
     <w:unhideWhenUsed/>
+    <w:qFormat/>
     <w:uiPriority w:val="99"/>
     <w:pPr>
       <w:tabs>
@@ -2140,6 +2011,7 @@
     <w:basedOn w:val="1"/>
     <w:link w:val="135"/>
     <w:unhideWhenUsed/>
+    <w:qFormat/>
     <w:uiPriority w:val="99"/>
     <w:pPr>
       <w:tabs>
@@ -2175,6 +2047,7 @@
     <w:name w:val="List"/>
     <w:basedOn w:val="1"/>
     <w:unhideWhenUsed/>
+    <w:qFormat/>
     <w:uiPriority w:val="99"/>
     <w:pPr>
       <w:ind w:left="360" w:hanging="360"/>
@@ -2186,6 +2059,7 @@
     <w:basedOn w:val="1"/>
     <w:link w:val="145"/>
     <w:unhideWhenUsed/>
+    <w:qFormat/>
     <w:uiPriority w:val="99"/>
     <w:pPr>
       <w:spacing w:after="120" w:line="480" w:lineRule="auto"/>
@@ -2195,6 +2069,7 @@
     <w:name w:val="List Continue 2"/>
     <w:basedOn w:val="1"/>
     <w:unhideWhenUsed/>
+    <w:qFormat/>
     <w:uiPriority w:val="99"/>
     <w:pPr>
       <w:spacing w:after="120"/>
@@ -2206,6 +2081,7 @@
     <w:name w:val="List Continue 3"/>
     <w:basedOn w:val="1"/>
     <w:unhideWhenUsed/>
+    <w:qFormat/>
     <w:uiPriority w:val="99"/>
     <w:pPr>
       <w:spacing w:after="120"/>
@@ -2239,6 +2115,7 @@
   <w:style w:type="table" w:styleId="33">
     <w:name w:val="Table Grid"/>
     <w:basedOn w:val="32"/>
+    <w:qFormat/>
     <w:uiPriority w:val="59"/>
     <w:pPr>
       <w:spacing w:after="0" w:line="240" w:lineRule="auto"/>
@@ -2263,6 +2140,7 @@
   <w:style w:type="table" w:styleId="34">
     <w:name w:val="Light Shading"/>
     <w:basedOn w:val="32"/>
+    <w:qFormat/>
     <w:uiPriority w:val="60"/>
     <w:pPr>
       <w:spacing w:after="0" w:line="240" w:lineRule="auto"/>
@@ -2362,6 +2240,7 @@
   <w:style w:type="table" w:styleId="35">
     <w:name w:val="Light Shading Accent 1"/>
     <w:basedOn w:val="32"/>
+    <w:qFormat/>
     <w:uiPriority w:val="60"/>
     <w:pPr>
       <w:spacing w:after="0" w:line="240" w:lineRule="auto"/>
@@ -2461,6 +2340,7 @@
   <w:style w:type="table" w:styleId="36">
     <w:name w:val="Light Shading Accent 2"/>
     <w:basedOn w:val="32"/>
+    <w:qFormat/>
     <w:uiPriority w:val="60"/>
     <w:pPr>
       <w:spacing w:after="0" w:line="240" w:lineRule="auto"/>
@@ -2560,6 +2440,7 @@
   <w:style w:type="table" w:styleId="37">
     <w:name w:val="Light Shading Accent 3"/>
     <w:basedOn w:val="32"/>
+    <w:qFormat/>
     <w:uiPriority w:val="60"/>
     <w:pPr>
       <w:spacing w:after="0" w:line="240" w:lineRule="auto"/>
@@ -2659,6 +2540,7 @@
   <w:style w:type="table" w:styleId="38">
     <w:name w:val="Light Shading Accent 4"/>
     <w:basedOn w:val="32"/>
+    <w:qFormat/>
     <w:uiPriority w:val="60"/>
     <w:pPr>
       <w:spacing w:after="0" w:line="240" w:lineRule="auto"/>
@@ -2758,6 +2640,7 @@
   <w:style w:type="table" w:styleId="39">
     <w:name w:val="Light Shading Accent 5"/>
     <w:basedOn w:val="32"/>
+    <w:qFormat/>
     <w:uiPriority w:val="60"/>
     <w:pPr>
       <w:spacing w:after="0" w:line="240" w:lineRule="auto"/>
@@ -2857,6 +2740,7 @@
   <w:style w:type="table" w:styleId="40">
     <w:name w:val="Light Shading Accent 6"/>
     <w:basedOn w:val="32"/>
+    <w:qFormat/>
     <w:uiPriority w:val="60"/>
     <w:pPr>
       <w:spacing w:after="0" w:line="240" w:lineRule="auto"/>
@@ -2956,6 +2840,7 @@
   <w:style w:type="table" w:styleId="41">
     <w:name w:val="Light List"/>
     <w:basedOn w:val="32"/>
+    <w:qFormat/>
     <w:uiPriority w:val="61"/>
     <w:pPr>
       <w:spacing w:after="0" w:line="240" w:lineRule="auto"/>
@@ -3049,6 +2934,7 @@
   <w:style w:type="table" w:styleId="42">
     <w:name w:val="Light List Accent 1"/>
     <w:basedOn w:val="32"/>
+    <w:qFormat/>
     <w:uiPriority w:val="61"/>
     <w:pPr>
       <w:spacing w:after="0" w:line="240" w:lineRule="auto"/>
@@ -3142,6 +3028,7 @@
   <w:style w:type="table" w:styleId="43">
     <w:name w:val="Light List Accent 2"/>
     <w:basedOn w:val="32"/>
+    <w:qFormat/>
     <w:uiPriority w:val="61"/>
     <w:pPr>
       <w:spacing w:after="0" w:line="240" w:lineRule="auto"/>
@@ -3235,6 +3122,7 @@
   <w:style w:type="table" w:styleId="44">
     <w:name w:val="Light List Accent 3"/>
     <w:basedOn w:val="32"/>
+    <w:qFormat/>
     <w:uiPriority w:val="61"/>
     <w:pPr>
       <w:spacing w:after="0" w:line="240" w:lineRule="auto"/>
@@ -3328,6 +3216,7 @@
   <w:style w:type="table" w:styleId="45">
     <w:name w:val="Light List Accent 4"/>
     <w:basedOn w:val="32"/>
+    <w:qFormat/>
     <w:uiPriority w:val="61"/>
     <w:pPr>
       <w:spacing w:after="0" w:line="240" w:lineRule="auto"/>
@@ -3421,6 +3310,7 @@
   <w:style w:type="table" w:styleId="46">
     <w:name w:val="Light List Accent 5"/>
     <w:basedOn w:val="32"/>
+    <w:qFormat/>
     <w:uiPriority w:val="61"/>
     <w:pPr>
       <w:spacing w:after="0" w:line="240" w:lineRule="auto"/>
@@ -3514,6 +3404,7 @@
   <w:style w:type="table" w:styleId="47">
     <w:name w:val="Light List Accent 6"/>
     <w:basedOn w:val="32"/>
+    <w:qFormat/>
     <w:uiPriority w:val="61"/>
     <w:pPr>
       <w:spacing w:after="0" w:line="240" w:lineRule="auto"/>
@@ -3607,6 +3498,7 @@
   <w:style w:type="table" w:styleId="48">
     <w:name w:val="Light Grid"/>
     <w:basedOn w:val="32"/>
+    <w:qFormat/>
     <w:uiPriority w:val="62"/>
     <w:pPr>
       <w:spacing w:after="0" w:line="240" w:lineRule="auto"/>
@@ -3733,6 +3625,7 @@
   <w:style w:type="table" w:styleId="49">
     <w:name w:val="Light Grid Accent 1"/>
     <w:basedOn w:val="32"/>
+    <w:qFormat/>
     <w:uiPriority w:val="62"/>
     <w:pPr>
       <w:spacing w:after="0" w:line="240" w:lineRule="auto"/>
@@ -3859,6 +3752,7 @@
   <w:style w:type="table" w:styleId="50">
     <w:name w:val="Light Grid Accent 2"/>
     <w:basedOn w:val="32"/>
+    <w:qFormat/>
     <w:uiPriority w:val="62"/>
     <w:pPr>
       <w:spacing w:after="0" w:line="240" w:lineRule="auto"/>
@@ -3985,6 +3879,7 @@
   <w:style w:type="table" w:styleId="51">
     <w:name w:val="Light Grid Accent 3"/>
     <w:basedOn w:val="32"/>
+    <w:qFormat/>
     <w:uiPriority w:val="62"/>
     <w:pPr>
       <w:spacing w:after="0" w:line="240" w:lineRule="auto"/>
@@ -4111,6 +4006,7 @@
   <w:style w:type="table" w:styleId="52">
     <w:name w:val="Light Grid Accent 4"/>
     <w:basedOn w:val="32"/>
+    <w:qFormat/>
     <w:uiPriority w:val="62"/>
     <w:pPr>
       <w:spacing w:after="0" w:line="240" w:lineRule="auto"/>
@@ -4237,6 +4133,7 @@
   <w:style w:type="table" w:styleId="53">
     <w:name w:val="Light Grid Accent 5"/>
     <w:basedOn w:val="32"/>
+    <w:qFormat/>
     <w:uiPriority w:val="62"/>
     <w:pPr>
       <w:spacing w:after="0" w:line="240" w:lineRule="auto"/>
@@ -4363,6 +4260,7 @@
   <w:style w:type="table" w:styleId="54">
     <w:name w:val="Light Grid Accent 6"/>
     <w:basedOn w:val="32"/>
+    <w:qFormat/>
     <w:uiPriority w:val="62"/>
     <w:pPr>
       <w:spacing w:after="0" w:line="240" w:lineRule="auto"/>
@@ -4489,6 +4387,7 @@
   <w:style w:type="table" w:styleId="55">
     <w:name w:val="Medium Shading 1"/>
     <w:basedOn w:val="32"/>
+    <w:qFormat/>
     <w:uiPriority w:val="63"/>
     <w:pPr>
       <w:spacing w:after="0" w:line="240" w:lineRule="auto"/>
@@ -4596,6 +4495,7 @@
   <w:style w:type="table" w:styleId="56">
     <w:name w:val="Medium Shading 1 Accent 1"/>
     <w:basedOn w:val="32"/>
+    <w:qFormat/>
     <w:uiPriority w:val="63"/>
     <w:pPr>
       <w:spacing w:after="0" w:line="240" w:lineRule="auto"/>
@@ -4703,6 +4603,7 @@
   <w:style w:type="table" w:styleId="57">
     <w:name w:val="Medium Shading 1 Accent 2"/>
     <w:basedOn w:val="32"/>
+    <w:qFormat/>
     <w:uiPriority w:val="63"/>
     <w:pPr>
       <w:spacing w:after="0" w:line="240" w:lineRule="auto"/>
@@ -4810,6 +4711,7 @@
   <w:style w:type="table" w:styleId="58">
     <w:name w:val="Medium Shading 1 Accent 3"/>
     <w:basedOn w:val="32"/>
+    <w:qFormat/>
     <w:uiPriority w:val="63"/>
     <w:pPr>
       <w:spacing w:after="0" w:line="240" w:lineRule="auto"/>
@@ -4917,6 +4819,7 @@
   <w:style w:type="table" w:styleId="59">
     <w:name w:val="Medium Shading 1 Accent 4"/>
     <w:basedOn w:val="32"/>
+    <w:qFormat/>
     <w:uiPriority w:val="63"/>
     <w:pPr>
       <w:spacing w:after="0" w:line="240" w:lineRule="auto"/>
@@ -5024,6 +4927,7 @@
   <w:style w:type="table" w:styleId="60">
     <w:name w:val="Medium Shading 1 Accent 5"/>
     <w:basedOn w:val="32"/>
+    <w:qFormat/>
     <w:uiPriority w:val="63"/>
     <w:pPr>
       <w:spacing w:after="0" w:line="240" w:lineRule="auto"/>
@@ -5131,6 +5035,7 @@
   <w:style w:type="table" w:styleId="61">
     <w:name w:val="Medium Shading 1 Accent 6"/>
     <w:basedOn w:val="32"/>
+    <w:qFormat/>
     <w:uiPriority w:val="63"/>
     <w:pPr>
       <w:spacing w:after="0" w:line="240" w:lineRule="auto"/>
@@ -5238,6 +5143,7 @@
   <w:style w:type="table" w:styleId="62">
     <w:name w:val="Medium Shading 2"/>
     <w:basedOn w:val="32"/>
+    <w:qFormat/>
     <w:uiPriority w:val="64"/>
     <w:pPr>
       <w:spacing w:after="0" w:line="240" w:lineRule="auto"/>
@@ -5403,6 +5309,7 @@
   <w:style w:type="table" w:styleId="63">
     <w:name w:val="Medium Shading 2 Accent 1"/>
     <w:basedOn w:val="32"/>
+    <w:qFormat/>
     <w:uiPriority w:val="64"/>
     <w:pPr>
       <w:spacing w:after="0" w:line="240" w:lineRule="auto"/>
@@ -5568,6 +5475,7 @@
   <w:style w:type="table" w:styleId="64">
     <w:name w:val="Medium Shading 2 Accent 2"/>
     <w:basedOn w:val="32"/>
+    <w:qFormat/>
     <w:uiPriority w:val="64"/>
     <w:pPr>
       <w:spacing w:after="0" w:line="240" w:lineRule="auto"/>
@@ -5733,6 +5641,7 @@
   <w:style w:type="table" w:styleId="65">
     <w:name w:val="Medium Shading 2 Accent 3"/>
     <w:basedOn w:val="32"/>
+    <w:qFormat/>
     <w:uiPriority w:val="64"/>
     <w:pPr>
       <w:spacing w:after="0" w:line="240" w:lineRule="auto"/>
@@ -5898,6 +5807,7 @@
   <w:style w:type="table" w:styleId="66">
     <w:name w:val="Medium Shading 2 Accent 4"/>
     <w:basedOn w:val="32"/>
+    <w:qFormat/>
     <w:uiPriority w:val="64"/>
     <w:pPr>
       <w:spacing w:after="0" w:line="240" w:lineRule="auto"/>
@@ -6063,6 +5973,7 @@
   <w:style w:type="table" w:styleId="67">
     <w:name w:val="Medium Shading 2 Accent 5"/>
     <w:basedOn w:val="32"/>
+    <w:qFormat/>
     <w:uiPriority w:val="64"/>
     <w:pPr>
       <w:spacing w:after="0" w:line="240" w:lineRule="auto"/>
@@ -6228,6 +6139,7 @@
   <w:style w:type="table" w:styleId="68">
     <w:name w:val="Medium Shading 2 Accent 6"/>
     <w:basedOn w:val="32"/>
+    <w:qFormat/>
     <w:uiPriority w:val="64"/>
     <w:pPr>
       <w:spacing w:after="0" w:line="240" w:lineRule="auto"/>
@@ -6393,6 +6305,7 @@
   <w:style w:type="table" w:styleId="69">
     <w:name w:val="Medium List 1"/>
     <w:basedOn w:val="32"/>
+    <w:qFormat/>
     <w:uiPriority w:val="65"/>
     <w:pPr>
       <w:spacing w:after="0" w:line="240" w:lineRule="auto"/>
@@ -6483,6 +6396,7 @@
   <w:style w:type="table" w:styleId="70">
     <w:name w:val="Medium List 1 Accent 1"/>
     <w:basedOn w:val="32"/>
+    <w:qFormat/>
     <w:uiPriority w:val="65"/>
     <w:pPr>
       <w:spacing w:after="0" w:line="240" w:lineRule="auto"/>
@@ -6573,6 +6487,7 @@
   <w:style w:type="table" w:styleId="71">
     <w:name w:val="Medium List 1 Accent 2"/>
     <w:basedOn w:val="32"/>
+    <w:qFormat/>
     <w:uiPriority w:val="65"/>
     <w:pPr>
       <w:spacing w:after="0" w:line="240" w:lineRule="auto"/>
@@ -6663,6 +6578,7 @@
   <w:style w:type="table" w:styleId="72">
     <w:name w:val="Medium List 1 Accent 3"/>
     <w:basedOn w:val="32"/>
+    <w:qFormat/>
     <w:uiPriority w:val="65"/>
     <w:pPr>
       <w:spacing w:after="0" w:line="240" w:lineRule="auto"/>
@@ -6753,6 +6669,7 @@
   <w:style w:type="table" w:styleId="73">
     <w:name w:val="Medium List 1 Accent 4"/>
     <w:basedOn w:val="32"/>
+    <w:qFormat/>
     <w:uiPriority w:val="65"/>
     <w:pPr>
       <w:spacing w:after="0" w:line="240" w:lineRule="auto"/>
@@ -6843,6 +6760,7 @@
   <w:style w:type="table" w:styleId="74">
     <w:name w:val="Medium List 1 Accent 5"/>
     <w:basedOn w:val="32"/>
+    <w:qFormat/>
     <w:uiPriority w:val="65"/>
     <w:pPr>
       <w:spacing w:after="0" w:line="240" w:lineRule="auto"/>
@@ -6933,6 +6851,7 @@
   <w:style w:type="table" w:styleId="75">
     <w:name w:val="Medium List 1 Accent 6"/>
     <w:basedOn w:val="32"/>
+    <w:qFormat/>
     <w:uiPriority w:val="65"/>
     <w:pPr>
       <w:spacing w:after="0" w:line="240" w:lineRule="auto"/>
@@ -7023,6 +6942,7 @@
   <w:style w:type="table" w:styleId="76">
     <w:name w:val="Medium List 2"/>
     <w:basedOn w:val="32"/>
+    <w:qFormat/>
     <w:uiPriority w:val="66"/>
     <w:pPr>
       <w:spacing w:after="0" w:line="240" w:lineRule="auto"/>
@@ -7152,6 +7072,7 @@
   <w:style w:type="table" w:styleId="77">
     <w:name w:val="Medium List 2 Accent 1"/>
     <w:basedOn w:val="32"/>
+    <w:qFormat/>
     <w:uiPriority w:val="66"/>
     <w:pPr>
       <w:spacing w:after="0" w:line="240" w:lineRule="auto"/>
@@ -7281,6 +7202,7 @@
   <w:style w:type="table" w:styleId="78">
     <w:name w:val="Medium List 2 Accent 2"/>
     <w:basedOn w:val="32"/>
+    <w:qFormat/>
     <w:uiPriority w:val="66"/>
     <w:pPr>
       <w:spacing w:after="0" w:line="240" w:lineRule="auto"/>
@@ -7539,6 +7461,7 @@
   <w:style w:type="table" w:styleId="80">
     <w:name w:val="Medium List 2 Accent 4"/>
     <w:basedOn w:val="32"/>
+    <w:qFormat/>
     <w:uiPriority w:val="66"/>
     <w:pPr>
       <w:spacing w:after="0" w:line="240" w:lineRule="auto"/>
@@ -7798,6 +7721,7 @@
   <w:style w:type="table" w:styleId="82">
     <w:name w:val="Medium List 2 Accent 6"/>
     <w:basedOn w:val="32"/>
+    <w:qFormat/>
     <w:uiPriority w:val="66"/>
     <w:pPr>
       <w:spacing w:after="0" w:line="240" w:lineRule="auto"/>
@@ -7927,6 +7851,7 @@
   <w:style w:type="table" w:styleId="83">
     <w:name w:val="Medium Grid 1"/>
     <w:basedOn w:val="32"/>
+    <w:qFormat/>
     <w:uiPriority w:val="67"/>
     <w:pPr>
       <w:spacing w:after="0" w:line="240" w:lineRule="auto"/>
@@ -8066,6 +7991,7 @@
   <w:style w:type="table" w:styleId="85">
     <w:name w:val="Medium Grid 1 Accent 2"/>
     <w:basedOn w:val="32"/>
+    <w:qFormat/>
     <w:uiPriority w:val="67"/>
     <w:pPr>
       <w:spacing w:after="0" w:line="240" w:lineRule="auto"/>
@@ -8205,6 +8131,7 @@
   <w:style w:type="table" w:styleId="87">
     <w:name w:val="Medium Grid 1 Accent 4"/>
     <w:basedOn w:val="32"/>
+    <w:qFormat/>
     <w:uiPriority w:val="67"/>
     <w:pPr>
       <w:spacing w:after="0" w:line="240" w:lineRule="auto"/>
@@ -8274,6 +8201,7 @@
   <w:style w:type="table" w:styleId="88">
     <w:name w:val="Medium Grid 1 Accent 5"/>
     <w:basedOn w:val="32"/>
+    <w:qFormat/>
     <w:uiPriority w:val="67"/>
     <w:pPr>
       <w:spacing w:after="0" w:line="240" w:lineRule="auto"/>
@@ -8413,6 +8341,7 @@
   <w:style w:type="table" w:styleId="90">
     <w:name w:val="Medium Grid 2"/>
     <w:basedOn w:val="32"/>
+    <w:qFormat/>
     <w:uiPriority w:val="68"/>
     <w:pPr>
       <w:spacing w:after="0" w:line="240" w:lineRule="auto"/>
@@ -8559,6 +8488,7 @@
   <w:style w:type="table" w:styleId="91">
     <w:name w:val="Medium Grid 2 Accent 1"/>
     <w:basedOn w:val="32"/>
+    <w:qFormat/>
     <w:uiPriority w:val="68"/>
     <w:pPr>
       <w:spacing w:after="0" w:line="240" w:lineRule="auto"/>
@@ -8705,6 +8635,7 @@
   <w:style w:type="table" w:styleId="92">
     <w:name w:val="Medium Grid 2 Accent 2"/>
     <w:basedOn w:val="32"/>
+    <w:qFormat/>
     <w:uiPriority w:val="68"/>
     <w:pPr>
       <w:spacing w:after="0" w:line="240" w:lineRule="auto"/>
@@ -8851,6 +8782,7 @@
   <w:style w:type="table" w:styleId="93">
     <w:name w:val="Medium Grid 2 Accent 3"/>
     <w:basedOn w:val="32"/>
+    <w:qFormat/>
     <w:uiPriority w:val="68"/>
     <w:pPr>
       <w:spacing w:after="0" w:line="240" w:lineRule="auto"/>
@@ -9144,6 +9076,7 @@
   <w:style w:type="table" w:styleId="95">
     <w:name w:val="Medium Grid 2 Accent 5"/>
     <w:basedOn w:val="32"/>
+    <w:qFormat/>
     <w:uiPriority w:val="68"/>
     <w:pPr>
       <w:spacing w:after="0" w:line="240" w:lineRule="auto"/>
@@ -9911,6 +9844,7 @@
   <w:style w:type="table" w:styleId="100">
     <w:name w:val="Medium Grid 3 Accent 3"/>
     <w:basedOn w:val="32"/>
+    <w:qFormat/>
     <w:uiPriority w:val="69"/>
     <w:pPr>
       <w:spacing w:after="0" w:line="240" w:lineRule="auto"/>
@@ -10068,6 +10002,7 @@
   <w:style w:type="table" w:styleId="101">
     <w:name w:val="Medium Grid 3 Accent 4"/>
     <w:basedOn w:val="32"/>
+    <w:qFormat/>
     <w:uiPriority w:val="69"/>
     <w:pPr>
       <w:spacing w:after="0" w:line="240" w:lineRule="auto"/>
@@ -10225,6 +10160,7 @@
   <w:style w:type="table" w:styleId="102">
     <w:name w:val="Medium Grid 3 Accent 5"/>
     <w:basedOn w:val="32"/>
+    <w:qFormat/>
     <w:uiPriority w:val="69"/>
     <w:pPr>
       <w:spacing w:after="0" w:line="240" w:lineRule="auto"/>
@@ -10772,6 +10708,7 @@
   <w:style w:type="table" w:styleId="106">
     <w:name w:val="Dark List Accent 2"/>
     <w:basedOn w:val="32"/>
+    <w:qFormat/>
     <w:uiPriority w:val="70"/>
     <w:pPr>
       <w:spacing w:after="0" w:line="240" w:lineRule="auto"/>
@@ -10887,6 +10824,7 @@
   <w:style w:type="table" w:styleId="107">
     <w:name w:val="Dark List Accent 3"/>
     <w:basedOn w:val="32"/>
+    <w:qFormat/>
     <w:uiPriority w:val="70"/>
     <w:pPr>
       <w:spacing w:after="0" w:line="240" w:lineRule="auto"/>
@@ -11002,6 +10940,7 @@
   <w:style w:type="table" w:styleId="108">
     <w:name w:val="Dark List Accent 4"/>
     <w:basedOn w:val="32"/>
+    <w:qFormat/>
     <w:uiPriority w:val="70"/>
     <w:pPr>
       <w:spacing w:after="0" w:line="240" w:lineRule="auto"/>
@@ -11117,6 +11056,7 @@
   <w:style w:type="table" w:styleId="109">
     <w:name w:val="Dark List Accent 5"/>
     <w:basedOn w:val="32"/>
+    <w:qFormat/>
     <w:uiPriority w:val="70"/>
     <w:pPr>
       <w:spacing w:after="0" w:line="240" w:lineRule="auto"/>
@@ -11232,6 +11172,7 @@
   <w:style w:type="table" w:styleId="110">
     <w:name w:val="Dark List Accent 6"/>
     <w:basedOn w:val="32"/>
+    <w:qFormat/>
     <w:uiPriority w:val="70"/>
     <w:pPr>
       <w:spacing w:after="0" w:line="240" w:lineRule="auto"/>
@@ -11347,6 +11288,7 @@
   <w:style w:type="table" w:styleId="111">
     <w:name w:val="Colorful Shading"/>
     <w:basedOn w:val="32"/>
+    <w:qFormat/>
     <w:uiPriority w:val="71"/>
     <w:pPr>
       <w:spacing w:after="0" w:line="240" w:lineRule="auto"/>
@@ -11495,6 +11437,7 @@
   <w:style w:type="table" w:styleId="112">
     <w:name w:val="Colorful Shading Accent 1"/>
     <w:basedOn w:val="32"/>
+    <w:qFormat/>
     <w:uiPriority w:val="71"/>
     <w:pPr>
       <w:spacing w:after="0" w:line="240" w:lineRule="auto"/>
@@ -11643,6 +11586,7 @@
   <w:style w:type="table" w:styleId="113">
     <w:name w:val="Colorful Shading Accent 2"/>
     <w:basedOn w:val="32"/>
+    <w:qFormat/>
     <w:uiPriority w:val="71"/>
     <w:pPr>
       <w:spacing w:after="0" w:line="240" w:lineRule="auto"/>
@@ -11791,6 +11735,7 @@
   <w:style w:type="table" w:styleId="114">
     <w:name w:val="Colorful Shading Accent 3"/>
     <w:basedOn w:val="32"/>
+    <w:qFormat/>
     <w:uiPriority w:val="71"/>
     <w:pPr>
       <w:spacing w:after="0" w:line="240" w:lineRule="auto"/>
@@ -11919,6 +11864,7 @@
   <w:style w:type="table" w:styleId="115">
     <w:name w:val="Colorful Shading Accent 4"/>
     <w:basedOn w:val="32"/>
+    <w:qFormat/>
     <w:uiPriority w:val="71"/>
     <w:pPr>
       <w:spacing w:after="0" w:line="240" w:lineRule="auto"/>
@@ -12067,6 +12013,7 @@
   <w:style w:type="table" w:styleId="116">
     <w:name w:val="Colorful Shading Accent 5"/>
     <w:basedOn w:val="32"/>
+    <w:qFormat/>
     <w:uiPriority w:val="71"/>
     <w:pPr>
       <w:spacing w:after="0" w:line="240" w:lineRule="auto"/>
@@ -12215,6 +12162,7 @@
   <w:style w:type="table" w:styleId="117">
     <w:name w:val="Colorful Shading Accent 6"/>
     <w:basedOn w:val="32"/>
+    <w:qFormat/>
     <w:uiPriority w:val="71"/>
     <w:pPr>
       <w:spacing w:after="0" w:line="240" w:lineRule="auto"/>
@@ -12363,6 +12311,7 @@
   <w:style w:type="table" w:styleId="118">
     <w:name w:val="Colorful List"/>
     <w:basedOn w:val="32"/>
+    <w:qFormat/>
     <w:uiPriority w:val="72"/>
     <w:pPr>
       <w:spacing w:after="0" w:line="240" w:lineRule="auto"/>
@@ -12455,6 +12404,7 @@
   <w:style w:type="table" w:styleId="119">
     <w:name w:val="Colorful List Accent 1"/>
     <w:basedOn w:val="32"/>
+    <w:qFormat/>
     <w:uiPriority w:val="72"/>
     <w:pPr>
       <w:spacing w:after="0" w:line="240" w:lineRule="auto"/>
@@ -12547,6 +12497,7 @@
   <w:style w:type="table" w:styleId="120">
     <w:name w:val="Colorful List Accent 2"/>
     <w:basedOn w:val="32"/>
+    <w:qFormat/>
     <w:uiPriority w:val="72"/>
     <w:pPr>
       <w:spacing w:after="0" w:line="240" w:lineRule="auto"/>
@@ -12639,6 +12590,7 @@
   <w:style w:type="table" w:styleId="121">
     <w:name w:val="Colorful List Accent 3"/>
     <w:basedOn w:val="32"/>
+    <w:qFormat/>
     <w:uiPriority w:val="72"/>
     <w:pPr>
       <w:spacing w:after="0" w:line="240" w:lineRule="auto"/>
@@ -12731,6 +12683,7 @@
   <w:style w:type="table" w:styleId="122">
     <w:name w:val="Colorful List Accent 4"/>
     <w:basedOn w:val="32"/>
+    <w:qFormat/>
     <w:uiPriority w:val="72"/>
     <w:pPr>
       <w:spacing w:after="0" w:line="240" w:lineRule="auto"/>
@@ -12823,6 +12776,7 @@
   <w:style w:type="table" w:styleId="123">
     <w:name w:val="Colorful List Accent 5"/>
     <w:basedOn w:val="32"/>
+    <w:qFormat/>
     <w:uiPriority w:val="72"/>
     <w:pPr>
       <w:spacing w:after="0" w:line="240" w:lineRule="auto"/>
@@ -12915,6 +12869,7 @@
   <w:style w:type="table" w:styleId="124">
     <w:name w:val="Colorful List Accent 6"/>
     <w:basedOn w:val="32"/>
+    <w:qFormat/>
     <w:uiPriority w:val="72"/>
     <w:pPr>
       <w:spacing w:after="0" w:line="240" w:lineRule="auto"/>
@@ -13007,6 +12962,7 @@
   <w:style w:type="table" w:styleId="125">
     <w:name w:val="Colorful Grid"/>
     <w:basedOn w:val="32"/>
+    <w:qFormat/>
     <w:uiPriority w:val="73"/>
     <w:pPr>
       <w:spacing w:after="0" w:line="240" w:lineRule="auto"/>
@@ -13103,6 +13059,7 @@
   <w:style w:type="table" w:styleId="126">
     <w:name w:val="Colorful Grid Accent 1"/>
     <w:basedOn w:val="32"/>
+    <w:qFormat/>
     <w:uiPriority w:val="73"/>
     <w:pPr>
       <w:spacing w:after="0" w:line="240" w:lineRule="auto"/>
@@ -13199,6 +13156,7 @@
   <w:style w:type="table" w:styleId="127">
     <w:name w:val="Colorful Grid Accent 2"/>
     <w:basedOn w:val="32"/>
+    <w:qFormat/>
     <w:uiPriority w:val="73"/>
     <w:pPr>
       <w:spacing w:after="0" w:line="240" w:lineRule="auto"/>
@@ -13295,6 +13253,7 @@
   <w:style w:type="table" w:styleId="128">
     <w:name w:val="Colorful Grid Accent 3"/>
     <w:basedOn w:val="32"/>
+    <w:qFormat/>
     <w:uiPriority w:val="73"/>
     <w:pPr>
       <w:spacing w:after="0" w:line="240" w:lineRule="auto"/>
@@ -13391,6 +13350,7 @@
   <w:style w:type="table" w:styleId="129">
     <w:name w:val="Colorful Grid Accent 4"/>
     <w:basedOn w:val="32"/>
+    <w:qFormat/>
     <w:uiPriority w:val="73"/>
     <w:pPr>
       <w:spacing w:after="0" w:line="240" w:lineRule="auto"/>
@@ -13487,6 +13447,7 @@
   <w:style w:type="table" w:styleId="130">
     <w:name w:val="Colorful Grid Accent 5"/>
     <w:basedOn w:val="32"/>
+    <w:qFormat/>
     <w:uiPriority w:val="73"/>
     <w:pPr>
       <w:spacing w:after="0" w:line="240" w:lineRule="auto"/>
@@ -13583,6 +13544,7 @@
   <w:style w:type="table" w:styleId="131">
     <w:name w:val="Colorful Grid Accent 6"/>
     <w:basedOn w:val="32"/>
+    <w:qFormat/>
     <w:uiPriority w:val="73"/>
     <w:pPr>
       <w:spacing w:after="0" w:line="240" w:lineRule="auto"/>
@@ -13700,12 +13662,14 @@
     <w:name w:val="Header Char"/>
     <w:basedOn w:val="132"/>
     <w:link w:val="25"/>
+    <w:qFormat/>
     <w:uiPriority w:val="99"/>
   </w:style>
   <w:style w:type="character" w:customStyle="1" w:styleId="136">
     <w:name w:val="Footer Char"/>
     <w:basedOn w:val="132"/>
     <w:link w:val="24"/>
+    <w:qFormat/>
     <w:uiPriority w:val="99"/>
   </w:style>
   <w:style w:type="paragraph" w:styleId="137">
@@ -13726,6 +13690,7 @@
     <w:name w:val="Heading 1 Char"/>
     <w:basedOn w:val="132"/>
     <w:link w:val="3"/>
+    <w:qFormat/>
     <w:uiPriority w:val="9"/>
     <w:rPr>
       <w:rFonts w:asciiTheme="majorHAnsi" w:hAnsiTheme="majorHAnsi" w:eastAsiaTheme="majorEastAsia" w:cstheme="majorBidi"/>
@@ -13760,6 +13725,7 @@
     <w:name w:val="Heading 3 Char"/>
     <w:basedOn w:val="132"/>
     <w:link w:val="5"/>
+    <w:qFormat/>
     <w:uiPriority w:val="9"/>
     <w:rPr>
       <w:rFonts w:asciiTheme="majorHAnsi" w:hAnsiTheme="majorHAnsi" w:eastAsiaTheme="majorEastAsia" w:cstheme="majorBidi"/>
@@ -13777,6 +13743,7 @@
     <w:name w:val="Title Char"/>
     <w:basedOn w:val="132"/>
     <w:link w:val="31"/>
+    <w:qFormat/>
     <w:uiPriority w:val="10"/>
     <w:rPr>
       <w:rFonts w:asciiTheme="majorHAnsi" w:hAnsiTheme="majorHAnsi" w:eastAsiaTheme="majorEastAsia" w:cstheme="majorBidi"/>
@@ -13791,6 +13758,7 @@
     <w:name w:val="Subtitle Char"/>
     <w:basedOn w:val="132"/>
     <w:link w:val="26"/>
+    <w:qFormat/>
     <w:uiPriority w:val="11"/>
     <w:rPr>
       <w:rFonts w:asciiTheme="majorHAnsi" w:hAnsiTheme="majorHAnsi" w:eastAsiaTheme="majorEastAsia" w:cstheme="majorBidi"/>
@@ -13835,6 +13803,7 @@
     <w:name w:val="Body Text 3 Char"/>
     <w:basedOn w:val="132"/>
     <w:link w:val="17"/>
+    <w:qFormat/>
     <w:uiPriority w:val="99"/>
     <w:rPr>
       <w:sz w:val="16"/>
@@ -13845,6 +13814,7 @@
     <w:name w:val="Macro Text Char"/>
     <w:basedOn w:val="132"/>
     <w:link w:val="2"/>
+    <w:qFormat/>
     <w:uiPriority w:val="99"/>
     <w:rPr>
       <w:rFonts w:ascii="Courier" w:hAnsi="Courier"/>
@@ -13874,6 +13844,7 @@
     <w:name w:val="Quote Char"/>
     <w:basedOn w:val="132"/>
     <w:link w:val="148"/>
+    <w:qFormat/>
     <w:uiPriority w:val="29"/>
     <w:rPr>
       <w:i/>
@@ -13891,6 +13862,7 @@
     <w:basedOn w:val="132"/>
     <w:link w:val="6"/>
     <w:semiHidden/>
+    <w:qFormat/>
     <w:uiPriority w:val="9"/>
     <w:rPr>
       <w:rFonts w:asciiTheme="majorHAnsi" w:hAnsiTheme="majorHAnsi" w:eastAsiaTheme="majorEastAsia" w:cstheme="majorBidi"/>
@@ -13911,6 +13883,7 @@
     <w:basedOn w:val="132"/>
     <w:link w:val="7"/>
     <w:semiHidden/>
+    <w:qFormat/>
     <w:uiPriority w:val="9"/>
     <w:rPr>
       <w:rFonts w:asciiTheme="majorHAnsi" w:hAnsiTheme="majorHAnsi" w:eastAsiaTheme="majorEastAsia" w:cstheme="majorBidi"/>
@@ -13922,6 +13895,7 @@
     <w:basedOn w:val="132"/>
     <w:link w:val="8"/>
     <w:semiHidden/>
+    <w:qFormat/>
     <w:uiPriority w:val="9"/>
     <w:rPr>
       <w:rFonts w:asciiTheme="majorHAnsi" w:hAnsiTheme="majorHAnsi" w:eastAsiaTheme="majorEastAsia" w:cstheme="majorBidi"/>
@@ -13935,6 +13909,7 @@
     <w:basedOn w:val="132"/>
     <w:link w:val="9"/>
     <w:semiHidden/>
+    <w:qFormat/>
     <w:uiPriority w:val="9"/>
     <w:rPr>
       <w:rFonts w:asciiTheme="majorHAnsi" w:hAnsiTheme="majorHAnsi" w:eastAsiaTheme="majorEastAsia" w:cstheme="majorBidi"/>
@@ -13956,6 +13931,7 @@
     <w:basedOn w:val="132"/>
     <w:link w:val="10"/>
     <w:semiHidden/>
+    <w:qFormat/>
     <w:uiPriority w:val="9"/>
     <w:rPr>
       <w:rFonts w:asciiTheme="majorHAnsi" w:hAnsiTheme="majorHAnsi" w:eastAsiaTheme="majorEastAsia" w:cstheme="majorBidi"/>
@@ -14023,6 +13999,7 @@
     <w:name w:val="Intense Quote Char"/>
     <w:basedOn w:val="132"/>
     <w:link w:val="156"/>
+    <w:qFormat/>
     <w:uiPriority w:val="30"/>
     <w:rPr>
       <w:b/>

</xml_diff>

<commit_message>
Revise main section headings I-IV to economics journal style
Co-authored-by: ruiheng111 <ruiheng111@users.noreply.github.com>
</commit_message>
<xml_diff>
--- a/新建 DOCX 文档.docx
+++ b/新建 DOCX 文档.docx
@@ -30,7 +30,7 @@
           <w:i w:val="0"/>
           <w:sz w:val="21"/>
         </w:rPr>
-        <w:t>一、危机前的东亚：增长、自由化与不可持续的金融结构</w:t>
+        <w:t>一、危机前的金融脆弱性</w:t>
       </w:r>
     </w:p>
     <w:p>
@@ -182,7 +182,7 @@
           <w:i w:val="0"/>
           <w:sz w:val="21"/>
         </w:rPr>
-        <w:t>二、危机的爆发与扩散：从泰国到区域性崩溃</w:t>
+        <w:t>二、危机爆发与跨境传导</w:t>
       </w:r>
     </w:p>
     <w:p>
@@ -369,7 +369,7 @@
           <w:i w:val="0"/>
           <w:sz w:val="21"/>
         </w:rPr>
-        <w:t>三、政策应对及其两难</w:t>
+        <w:t>三、政策应对与主要争议</w:t>
       </w:r>
     </w:p>
     <w:p>
@@ -517,7 +517,7 @@
           <w:i w:val="0"/>
           <w:sz w:val="21"/>
         </w:rPr>
-        <w:t>四、成因机制：货币、银行与国际因素的交织</w:t>
+        <w:t>四、成因机制：货币、银行与国际因素</w:t>
       </w:r>
     </w:p>
     <w:p>

</xml_diff>